<commit_message>
Rapport: ajout du lien du depot GitHub
</commit_message>
<xml_diff>
--- a/Rapport_Projet5_Qualite_Air.docx
+++ b/Rapport_Projet5_Qualite_Air.docx
@@ -8992,7 +8992,7 @@
         </w:rPr>
         <w:t xml:space="preserve">Simulation Wokwi : </w:t>
       </w:r>
-      <w:hyperlink w:history="1" r:id="rId4zfysu1a0o4k0cm7o5pjx">
+      <w:hyperlink w:history="1" r:id="rId9mitw_vvyddku22nyebio">
         <w:r>
           <w:rPr>
             <w:rStyle w:val="Hyperlink"/>
@@ -9016,16 +9016,16 @@
         </w:rPr>
         <w:t xml:space="preserve">Depot Git : </w:t>
       </w:r>
-      <w:r>
-        <w:rPr>
-          <w:i/>
-          <w:iCs/>
-          <w:color w:val="777777"/>
-          <w:sz w:val="22"/>
-          <w:szCs w:val="22"/>
-        </w:rPr>
-        <w:t xml:space="preserve">[ A COMPLETER - lien du depot GitHub ]</w:t>
-      </w:r>
+      <w:hyperlink w:history="1" r:id="rIdlmahasml8ns4pnox4kesp">
+        <w:r>
+          <w:rPr>
+            <w:rStyle w:val="Hyperlink"/>
+            <w:sz w:val="22"/>
+            <w:szCs w:val="22"/>
+          </w:rPr>
+          <w:t xml:space="preserve">github.com/mohamed-elhaimer/smarthome-air-quality-esp32</w:t>
+        </w:r>
+      </w:hyperlink>
     </w:p>
     <w:p>
       <w:r>

</xml_diff>

<commit_message>
Rapport: integration des captures Blynk (dashboard, events) et circuit Wokwi
</commit_message>
<xml_diff>
--- a/Rapport_Projet5_Qualite_Air.docx
+++ b/Rapport_Projet5_Qualite_Air.docx
@@ -2815,73 +2815,52 @@
         <w:t xml:space="preserve"/>
       </w:r>
     </w:p>
-    <w:tbl>
-      <w:tblPr>
-        <w:tblW w:type="dxa" w:w="9360"/>
-        <w:tblBorders>
-          <w:top w:val="single" w:color="auto" w:sz="4"/>
-          <w:left w:val="single" w:color="auto" w:sz="4"/>
-          <w:bottom w:val="single" w:color="auto" w:sz="4"/>
-          <w:right w:val="single" w:color="auto" w:sz="4"/>
-          <w:insideH w:val="single" w:color="auto" w:sz="4"/>
-          <w:insideV w:val="single" w:color="auto" w:sz="4"/>
-        </w:tblBorders>
-      </w:tblPr>
-      <w:tblGrid>
-        <w:gridCol w:w="9360"/>
-      </w:tblGrid>
-      <w:tr>
-        <w:tc>
-          <w:tcPr>
-            <w:tcW w:type="dxa" w:w="9360"/>
-            <w:tcBorders>
-              <w:top w:val="dashed" w:color="888888" w:sz="1"/>
-              <w:left w:val="dashed" w:color="888888" w:sz="1"/>
-              <w:bottom w:val="dashed" w:color="888888" w:sz="1"/>
-              <w:right w:val="dashed" w:color="888888" w:sz="1"/>
-            </w:tcBorders>
-            <w:shd w:fill="F0F0F0" w:val="clear"/>
-            <w:tcMar>
-              <w:top w:type="dxa" w:w="400"/>
-              <w:left w:type="dxa" w:w="120"/>
-              <w:bottom w:type="dxa" w:w="400"/>
-              <w:right w:type="dxa" w:w="120"/>
-            </w:tcMar>
-            <w:vAlign w:val="center"/>
-          </w:tcPr>
-          <w:p>
-            <w:pPr>
-              <w:jc w:val="center"/>
-            </w:pPr>
-            <w:r>
-              <w:rPr>
-                <w:b/>
-                <w:bCs/>
-                <w:color w:val="777777"/>
-                <w:sz w:val="20"/>
-                <w:szCs w:val="20"/>
-              </w:rPr>
-              <w:t xml:space="preserve">[ INSEREZ ICI VOTRE CAPTURE D'ECRAN ]</w:t>
-            </w:r>
-          </w:p>
-          <w:p>
-            <w:pPr>
-              <w:jc w:val="center"/>
-            </w:pPr>
-            <w:r>
-              <w:rPr>
-                <w:i/>
-                <w:iCs/>
-                <w:color w:val="555555"/>
-                <w:sz w:val="20"/>
-                <w:szCs w:val="20"/>
-              </w:rPr>
-              <w:t xml:space="preserve">Figure 2 : Schema de cablage complet sur Wokwi (diagram.json)</w:t>
-            </w:r>
-          </w:p>
-        </w:tc>
-      </w:tr>
-    </w:tbl>
+    <w:p>
+      <w:pPr>
+        <w:spacing w:after="60"/>
+        <w:jc w:val="center"/>
+      </w:pPr>
+      <w:r>
+        <w:drawing>
+          <wp:inline distT="0" distB="0" distL="0" distR="0">
+            <wp:extent cx="5715000" cy="3124200"/>
+            <wp:effectExtent t="0" r="0" b="0" l="0"/>
+            <wp:docPr id="1" name="fig2_cablage.png" descr="Figure 2 : Schema de cablage complet sur Wokwi (diagram.json)" title="Figure 2 : Schema de cablage complet sur Wokwi (diagram.json)"/>
+            <wp:cNvGraphicFramePr>
+              <a:graphicFrameLocks xmlns:a="http://schemas.openxmlformats.org/drawingml/2006/main" noChangeAspect="1"/>
+            </wp:cNvGraphicFramePr>
+            <a:graphic xmlns:a="http://schemas.openxmlformats.org/drawingml/2006/main">
+              <a:graphicData uri="http://schemas.openxmlformats.org/drawingml/2006/picture">
+                <pic:pic xmlns:pic="http://schemas.openxmlformats.org/drawingml/2006/picture">
+                  <pic:nvPicPr>
+                    <pic:cNvPr id="0" name="" descr=""/>
+                    <pic:cNvPicPr>
+                      <a:picLocks noChangeAspect="1" noChangeArrowheads="1"/>
+                    </pic:cNvPicPr>
+                  </pic:nvPicPr>
+                  <pic:blipFill>
+                    <a:blip r:embed="rId9" cstate="none"/>
+                    <a:srcRect/>
+                    <a:stretch>
+                      <a:fillRect/>
+                    </a:stretch>
+                  </pic:blipFill>
+                  <pic:spPr bwMode="auto">
+                    <a:xfrm>
+                      <a:off x="0" y="0"/>
+                      <a:ext cx="5715000" cy="3124200"/>
+                    </a:xfrm>
+                    <a:prstGeom prst="rect">
+                      <a:avLst/>
+                    </a:prstGeom>
+                  </pic:spPr>
+                </pic:pic>
+              </a:graphicData>
+            </a:graphic>
+          </wp:inline>
+        </w:drawing>
+      </w:r>
+    </w:p>
     <w:p>
       <w:r>
         <w:br w:type="page"/>
@@ -7544,145 +7523,103 @@
         <w:t xml:space="preserve"/>
       </w:r>
     </w:p>
-    <w:tbl>
-      <w:tblPr>
-        <w:tblW w:type="dxa" w:w="9360"/>
-        <w:tblBorders>
-          <w:top w:val="single" w:color="auto" w:sz="4"/>
-          <w:left w:val="single" w:color="auto" w:sz="4"/>
-          <w:bottom w:val="single" w:color="auto" w:sz="4"/>
-          <w:right w:val="single" w:color="auto" w:sz="4"/>
-          <w:insideH w:val="single" w:color="auto" w:sz="4"/>
-          <w:insideV w:val="single" w:color="auto" w:sz="4"/>
-        </w:tblBorders>
-      </w:tblPr>
-      <w:tblGrid>
-        <w:gridCol w:w="9360"/>
-      </w:tblGrid>
-      <w:tr>
-        <w:tc>
-          <w:tcPr>
-            <w:tcW w:type="dxa" w:w="9360"/>
-            <w:tcBorders>
-              <w:top w:val="dashed" w:color="888888" w:sz="1"/>
-              <w:left w:val="dashed" w:color="888888" w:sz="1"/>
-              <w:bottom w:val="dashed" w:color="888888" w:sz="1"/>
-              <w:right w:val="dashed" w:color="888888" w:sz="1"/>
-            </w:tcBorders>
-            <w:shd w:fill="F0F0F0" w:val="clear"/>
-            <w:tcMar>
-              <w:top w:type="dxa" w:w="400"/>
-              <w:left w:type="dxa" w:w="120"/>
-              <w:bottom w:type="dxa" w:w="400"/>
-              <w:right w:type="dxa" w:w="120"/>
-            </w:tcMar>
-            <w:vAlign w:val="center"/>
-          </w:tcPr>
-          <w:p>
-            <w:pPr>
-              <w:jc w:val="center"/>
-            </w:pPr>
-            <w:r>
-              <w:rPr>
-                <w:b/>
-                <w:bCs/>
-                <w:color w:val="777777"/>
-                <w:sz w:val="20"/>
-                <w:szCs w:val="20"/>
-              </w:rPr>
-              <w:t xml:space="preserve">[ INSEREZ ICI VOTRE CAPTURE D'ECRAN ]</w:t>
-            </w:r>
-          </w:p>
-          <w:p>
-            <w:pPr>
-              <w:jc w:val="center"/>
-            </w:pPr>
-            <w:r>
-              <w:rPr>
-                <w:i/>
-                <w:iCs/>
-                <w:color w:val="555555"/>
-                <w:sz w:val="20"/>
-                <w:szCs w:val="20"/>
-              </w:rPr>
-              <w:t xml:space="preserve">Figure 4 : Tableau de bord Blynk (4 jauges + LED couleur + graphique d'historique)</w:t>
-            </w:r>
-          </w:p>
-        </w:tc>
-      </w:tr>
-    </w:tbl>
+    <w:p>
+      <w:pPr>
+        <w:spacing w:after="60"/>
+        <w:jc w:val="center"/>
+      </w:pPr>
+      <w:r>
+        <w:drawing>
+          <wp:inline distT="0" distB="0" distL="0" distR="0">
+            <wp:extent cx="5715000" cy="2914650"/>
+            <wp:effectExtent t="0" r="0" b="0" l="0"/>
+            <wp:docPr id="1" name="fig4_dashboard.png" descr="Figure 4 : Tableau de bord Blynk (4 jauges + LED couleur + graphique d'historique)" title="Figure 4 : Tableau de bord Blynk (4 jauges + LED couleur + graphique d'historique)"/>
+            <wp:cNvGraphicFramePr>
+              <a:graphicFrameLocks xmlns:a="http://schemas.openxmlformats.org/drawingml/2006/main" noChangeAspect="1"/>
+            </wp:cNvGraphicFramePr>
+            <a:graphic xmlns:a="http://schemas.openxmlformats.org/drawingml/2006/main">
+              <a:graphicData uri="http://schemas.openxmlformats.org/drawingml/2006/picture">
+                <pic:pic xmlns:pic="http://schemas.openxmlformats.org/drawingml/2006/picture">
+                  <pic:nvPicPr>
+                    <pic:cNvPr id="0" name="" descr=""/>
+                    <pic:cNvPicPr>
+                      <a:picLocks noChangeAspect="1" noChangeArrowheads="1"/>
+                    </pic:cNvPicPr>
+                  </pic:nvPicPr>
+                  <pic:blipFill>
+                    <a:blip r:embed="rId10" cstate="none"/>
+                    <a:srcRect/>
+                    <a:stretch>
+                      <a:fillRect/>
+                    </a:stretch>
+                  </pic:blipFill>
+                  <pic:spPr bwMode="auto">
+                    <a:xfrm>
+                      <a:off x="0" y="0"/>
+                      <a:ext cx="5715000" cy="2914650"/>
+                    </a:xfrm>
+                    <a:prstGeom prst="rect">
+                      <a:avLst/>
+                    </a:prstGeom>
+                  </pic:spPr>
+                </pic:pic>
+              </a:graphicData>
+            </a:graphic>
+          </wp:inline>
+        </w:drawing>
+      </w:r>
+    </w:p>
     <w:p>
       <w:r>
         <w:t xml:space="preserve"/>
       </w:r>
     </w:p>
-    <w:tbl>
-      <w:tblPr>
-        <w:tblW w:type="dxa" w:w="9360"/>
-        <w:tblBorders>
-          <w:top w:val="single" w:color="auto" w:sz="4"/>
-          <w:left w:val="single" w:color="auto" w:sz="4"/>
-          <w:bottom w:val="single" w:color="auto" w:sz="4"/>
-          <w:right w:val="single" w:color="auto" w:sz="4"/>
-          <w:insideH w:val="single" w:color="auto" w:sz="4"/>
-          <w:insideV w:val="single" w:color="auto" w:sz="4"/>
-        </w:tblBorders>
-      </w:tblPr>
-      <w:tblGrid>
-        <w:gridCol w:w="9360"/>
-      </w:tblGrid>
-      <w:tr>
-        <w:tc>
-          <w:tcPr>
-            <w:tcW w:type="dxa" w:w="9360"/>
-            <w:tcBorders>
-              <w:top w:val="dashed" w:color="888888" w:sz="1"/>
-              <w:left w:val="dashed" w:color="888888" w:sz="1"/>
-              <w:bottom w:val="dashed" w:color="888888" w:sz="1"/>
-              <w:right w:val="dashed" w:color="888888" w:sz="1"/>
-            </w:tcBorders>
-            <w:shd w:fill="F0F0F0" w:val="clear"/>
-            <w:tcMar>
-              <w:top w:type="dxa" w:w="400"/>
-              <w:left w:type="dxa" w:w="120"/>
-              <w:bottom w:type="dxa" w:w="400"/>
-              <w:right w:type="dxa" w:w="120"/>
-            </w:tcMar>
-            <w:vAlign w:val="center"/>
-          </w:tcPr>
-          <w:p>
-            <w:pPr>
-              <w:jc w:val="center"/>
-            </w:pPr>
-            <w:r>
-              <w:rPr>
-                <w:b/>
-                <w:bCs/>
-                <w:color w:val="777777"/>
-                <w:sz w:val="20"/>
-                <w:szCs w:val="20"/>
-              </w:rPr>
-              <w:t xml:space="preserve">[ INSEREZ ICI VOTRE CAPTURE D'ECRAN ]</w:t>
-            </w:r>
-          </w:p>
-          <w:p>
-            <w:pPr>
-              <w:jc w:val="center"/>
-            </w:pPr>
-            <w:r>
-              <w:rPr>
-                <w:i/>
-                <w:iCs/>
-                <w:color w:val="555555"/>
-                <w:sz w:val="20"/>
-                <w:szCs w:val="20"/>
-              </w:rPr>
-              <w:t xml:space="preserve">Figure 5 : Notification push Blynk a l'entree en etat pollue</w:t>
-            </w:r>
-          </w:p>
-        </w:tc>
-      </w:tr>
-    </w:tbl>
+    <w:p>
+      <w:pPr>
+        <w:spacing w:after="60"/>
+        <w:jc w:val="center"/>
+      </w:pPr>
+      <w:r>
+        <w:drawing>
+          <wp:inline distT="0" distB="0" distL="0" distR="0">
+            <wp:extent cx="5715000" cy="2914650"/>
+            <wp:effectExtent t="0" r="0" b="0" l="0"/>
+            <wp:docPr id="1" name="fig5_notification.png" descr="Figure 5 : Notification push Blynk a l'entree en etat pollue" title="Figure 5 : Notification push Blynk a l'entree en etat pollue"/>
+            <wp:cNvGraphicFramePr>
+              <a:graphicFrameLocks xmlns:a="http://schemas.openxmlformats.org/drawingml/2006/main" noChangeAspect="1"/>
+            </wp:cNvGraphicFramePr>
+            <a:graphic xmlns:a="http://schemas.openxmlformats.org/drawingml/2006/main">
+              <a:graphicData uri="http://schemas.openxmlformats.org/drawingml/2006/picture">
+                <pic:pic xmlns:pic="http://schemas.openxmlformats.org/drawingml/2006/picture">
+                  <pic:nvPicPr>
+                    <pic:cNvPr id="0" name="" descr=""/>
+                    <pic:cNvPicPr>
+                      <a:picLocks noChangeAspect="1" noChangeArrowheads="1"/>
+                    </pic:cNvPicPr>
+                  </pic:nvPicPr>
+                  <pic:blipFill>
+                    <a:blip r:embed="rId11" cstate="none"/>
+                    <a:srcRect/>
+                    <a:stretch>
+                      <a:fillRect/>
+                    </a:stretch>
+                  </pic:blipFill>
+                  <pic:spPr bwMode="auto">
+                    <a:xfrm>
+                      <a:off x="0" y="0"/>
+                      <a:ext cx="5715000" cy="2914650"/>
+                    </a:xfrm>
+                    <a:prstGeom prst="rect">
+                      <a:avLst/>
+                    </a:prstGeom>
+                  </pic:spPr>
+                </pic:pic>
+              </a:graphicData>
+            </a:graphic>
+          </wp:inline>
+        </w:drawing>
+      </w:r>
+    </w:p>
     <w:p>
       <w:r>
         <w:br w:type="page"/>
@@ -8992,7 +8929,7 @@
         </w:rPr>
         <w:t xml:space="preserve">Simulation Wokwi : </w:t>
       </w:r>
-      <w:hyperlink w:history="1" r:id="rId9mitw_vvyddku22nyebio">
+      <w:hyperlink w:history="1" r:id="rIdmcyeki4yeh9uekenbkdrs">
         <w:r>
           <w:rPr>
             <w:rStyle w:val="Hyperlink"/>
@@ -9016,7 +8953,7 @@
         </w:rPr>
         <w:t xml:space="preserve">Depot Git : </w:t>
       </w:r>
-      <w:hyperlink w:history="1" r:id="rIdlmahasml8ns4pnox4kesp">
+      <w:hyperlink w:history="1" r:id="rIdq9xn58a67mtlr4sceq3gz">
         <w:r>
           <w:rPr>
             <w:rStyle w:val="Hyperlink"/>

</xml_diff>

<commit_message>
Rapport final : integration de toutes les captures (Wokwi SAIN/MODERE/POLLUE + Blynk)
</commit_message>
<xml_diff>
--- a/Rapport_Projet5_Qualite_Air.docx
+++ b/Rapport_Projet5_Qualite_Air.docx
@@ -2823,7 +2823,7 @@
       <w:r>
         <w:drawing>
           <wp:inline distT="0" distB="0" distL="0" distR="0">
-            <wp:extent cx="5715000" cy="3124200"/>
+            <wp:extent cx="5715000" cy="4905375"/>
             <wp:effectExtent t="0" r="0" b="0" l="0"/>
             <wp:docPr id="1" name="fig2_cablage.png" descr="Figure 2 : Schema de cablage complet sur Wokwi (diagram.json)" title="Figure 2 : Schema de cablage complet sur Wokwi (diagram.json)"/>
             <wp:cNvGraphicFramePr>
@@ -2848,7 +2848,7 @@
                   <pic:spPr bwMode="auto">
                     <a:xfrm>
                       <a:off x="0" y="0"/>
-                      <a:ext cx="5715000" cy="3124200"/>
+                      <a:ext cx="5715000" cy="4905375"/>
                     </a:xfrm>
                     <a:prstGeom prst="rect">
                       <a:avLst/>
@@ -7451,78 +7451,6 @@
         <w:t xml:space="preserve">Le widget LED (V4) change de couleur selon l'etat : vert (sain), orange (modere), rouge (pollue). Un graphique (Chart) sur V3 trace l'historique de l'indice global. Un evenement nomme air_pollue est configure pour les notifications push.</w:t>
       </w:r>
     </w:p>
-    <w:tbl>
-      <w:tblPr>
-        <w:tblW w:type="dxa" w:w="9360"/>
-        <w:tblBorders>
-          <w:top w:val="single" w:color="auto" w:sz="4"/>
-          <w:left w:val="single" w:color="auto" w:sz="4"/>
-          <w:bottom w:val="single" w:color="auto" w:sz="4"/>
-          <w:right w:val="single" w:color="auto" w:sz="4"/>
-          <w:insideH w:val="single" w:color="auto" w:sz="4"/>
-          <w:insideV w:val="single" w:color="auto" w:sz="4"/>
-        </w:tblBorders>
-      </w:tblPr>
-      <w:tblGrid>
-        <w:gridCol w:w="9360"/>
-      </w:tblGrid>
-      <w:tr>
-        <w:tc>
-          <w:tcPr>
-            <w:tcW w:type="dxa" w:w="9360"/>
-            <w:tcBorders>
-              <w:top w:val="dashed" w:color="888888" w:sz="1"/>
-              <w:left w:val="dashed" w:color="888888" w:sz="1"/>
-              <w:bottom w:val="dashed" w:color="888888" w:sz="1"/>
-              <w:right w:val="dashed" w:color="888888" w:sz="1"/>
-            </w:tcBorders>
-            <w:shd w:fill="F0F0F0" w:val="clear"/>
-            <w:tcMar>
-              <w:top w:type="dxa" w:w="400"/>
-              <w:left w:type="dxa" w:w="120"/>
-              <w:bottom w:type="dxa" w:w="400"/>
-              <w:right w:type="dxa" w:w="120"/>
-            </w:tcMar>
-            <w:vAlign w:val="center"/>
-          </w:tcPr>
-          <w:p>
-            <w:pPr>
-              <w:jc w:val="center"/>
-            </w:pPr>
-            <w:r>
-              <w:rPr>
-                <w:b/>
-                <w:bCs/>
-                <w:color w:val="777777"/>
-                <w:sz w:val="20"/>
-                <w:szCs w:val="20"/>
-              </w:rPr>
-              <w:t xml:space="preserve">[ INSEREZ ICI VOTRE CAPTURE D'ECRAN ]</w:t>
-            </w:r>
-          </w:p>
-          <w:p>
-            <w:pPr>
-              <w:jc w:val="center"/>
-            </w:pPr>
-            <w:r>
-              <w:rPr>
-                <w:i/>
-                <w:iCs/>
-                <w:color w:val="555555"/>
-                <w:sz w:val="20"/>
-                <w:szCs w:val="20"/>
-              </w:rPr>
-              <w:t xml:space="preserve">Figure 3 : Datastreams V0-V4 configures dans Blynk</w:t>
-            </w:r>
-          </w:p>
-        </w:tc>
-      </w:tr>
-    </w:tbl>
-    <w:p>
-      <w:r>
-        <w:t xml:space="preserve"/>
-      </w:r>
-    </w:p>
     <w:p>
       <w:pPr>
         <w:spacing w:after="60"/>
@@ -7531,9 +7459,9 @@
       <w:r>
         <w:drawing>
           <wp:inline distT="0" distB="0" distL="0" distR="0">
-            <wp:extent cx="5715000" cy="2914650"/>
+            <wp:extent cx="5715000" cy="3124200"/>
             <wp:effectExtent t="0" r="0" b="0" l="0"/>
-            <wp:docPr id="1" name="fig4_dashboard.png" descr="Figure 4 : Tableau de bord Blynk (4 jauges + LED couleur + graphique d'historique)" title="Figure 4 : Tableau de bord Blynk (4 jauges + LED couleur + graphique d'historique)"/>
+            <wp:docPr id="1" name="fig3_datastreams.png" descr="Figure 3 : Datastreams V0-V4 configures dans Blynk" title="Figure 3 : Datastreams V0-V4 configures dans Blynk"/>
             <wp:cNvGraphicFramePr>
               <a:graphicFrameLocks xmlns:a="http://schemas.openxmlformats.org/drawingml/2006/main" noChangeAspect="1"/>
             </wp:cNvGraphicFramePr>
@@ -7556,7 +7484,7 @@
                   <pic:spPr bwMode="auto">
                     <a:xfrm>
                       <a:off x="0" y="0"/>
-                      <a:ext cx="5715000" cy="2914650"/>
+                      <a:ext cx="5715000" cy="3124200"/>
                     </a:xfrm>
                     <a:prstGeom prst="rect">
                       <a:avLst/>
@@ -7584,7 +7512,7 @@
           <wp:inline distT="0" distB="0" distL="0" distR="0">
             <wp:extent cx="5715000" cy="2914650"/>
             <wp:effectExtent t="0" r="0" b="0" l="0"/>
-            <wp:docPr id="1" name="fig5_notification.png" descr="Figure 5 : Notification push Blynk a l'entree en etat pollue" title="Figure 5 : Notification push Blynk a l'entree en etat pollue"/>
+            <wp:docPr id="1" name="fig4_dashboard.png" descr="Figure 4 : Tableau de bord Blynk (4 jauges + LED couleur + graphique d'historique)" title="Figure 4 : Tableau de bord Blynk (4 jauges + LED couleur + graphique d'historique)"/>
             <wp:cNvGraphicFramePr>
               <a:graphicFrameLocks xmlns:a="http://schemas.openxmlformats.org/drawingml/2006/main" noChangeAspect="1"/>
             </wp:cNvGraphicFramePr>
@@ -7622,6 +7550,57 @@
     </w:p>
     <w:p>
       <w:r>
+        <w:t xml:space="preserve"/>
+      </w:r>
+    </w:p>
+    <w:p>
+      <w:pPr>
+        <w:spacing w:after="60"/>
+        <w:jc w:val="center"/>
+      </w:pPr>
+      <w:r>
+        <w:drawing>
+          <wp:inline distT="0" distB="0" distL="0" distR="0">
+            <wp:extent cx="5715000" cy="2914650"/>
+            <wp:effectExtent t="0" r="0" b="0" l="0"/>
+            <wp:docPr id="1" name="fig5_notification.png" descr="Figure 5 : Notification push Blynk a l'entree en etat pollue" title="Figure 5 : Notification push Blynk a l'entree en etat pollue"/>
+            <wp:cNvGraphicFramePr>
+              <a:graphicFrameLocks xmlns:a="http://schemas.openxmlformats.org/drawingml/2006/main" noChangeAspect="1"/>
+            </wp:cNvGraphicFramePr>
+            <a:graphic xmlns:a="http://schemas.openxmlformats.org/drawingml/2006/main">
+              <a:graphicData uri="http://schemas.openxmlformats.org/drawingml/2006/picture">
+                <pic:pic xmlns:pic="http://schemas.openxmlformats.org/drawingml/2006/picture">
+                  <pic:nvPicPr>
+                    <pic:cNvPr id="0" name="" descr=""/>
+                    <pic:cNvPicPr>
+                      <a:picLocks noChangeAspect="1" noChangeArrowheads="1"/>
+                    </pic:cNvPicPr>
+                  </pic:nvPicPr>
+                  <pic:blipFill>
+                    <a:blip r:embed="rId12" cstate="none"/>
+                    <a:srcRect/>
+                    <a:stretch>
+                      <a:fillRect/>
+                    </a:stretch>
+                  </pic:blipFill>
+                  <pic:spPr bwMode="auto">
+                    <a:xfrm>
+                      <a:off x="0" y="0"/>
+                      <a:ext cx="5715000" cy="2914650"/>
+                    </a:xfrm>
+                    <a:prstGeom prst="rect">
+                      <a:avLst/>
+                    </a:prstGeom>
+                  </pic:spPr>
+                </pic:pic>
+              </a:graphicData>
+            </a:graphic>
+          </wp:inline>
+        </w:drawing>
+      </w:r>
+    </w:p>
+    <w:p>
+      <w:r>
         <w:br w:type="page"/>
       </w:r>
     </w:p>
@@ -8443,73 +8422,154 @@
         <w:t xml:space="preserve"/>
       </w:r>
     </w:p>
-    <w:tbl>
-      <w:tblPr>
-        <w:tblW w:type="dxa" w:w="9360"/>
-        <w:tblBorders>
-          <w:top w:val="single" w:color="auto" w:sz="4"/>
-          <w:left w:val="single" w:color="auto" w:sz="4"/>
-          <w:bottom w:val="single" w:color="auto" w:sz="4"/>
-          <w:right w:val="single" w:color="auto" w:sz="4"/>
-          <w:insideH w:val="single" w:color="auto" w:sz="4"/>
-          <w:insideV w:val="single" w:color="auto" w:sz="4"/>
-        </w:tblBorders>
-      </w:tblPr>
-      <w:tblGrid>
-        <w:gridCol w:w="9360"/>
-      </w:tblGrid>
-      <w:tr>
-        <w:tc>
-          <w:tcPr>
-            <w:tcW w:type="dxa" w:w="9360"/>
-            <w:tcBorders>
-              <w:top w:val="dashed" w:color="888888" w:sz="1"/>
-              <w:left w:val="dashed" w:color="888888" w:sz="1"/>
-              <w:bottom w:val="dashed" w:color="888888" w:sz="1"/>
-              <w:right w:val="dashed" w:color="888888" w:sz="1"/>
-            </w:tcBorders>
-            <w:shd w:fill="F0F0F0" w:val="clear"/>
-            <w:tcMar>
-              <w:top w:type="dxa" w:w="400"/>
-              <w:left w:type="dxa" w:w="120"/>
-              <w:bottom w:type="dxa" w:w="400"/>
-              <w:right w:type="dxa" w:w="120"/>
-            </w:tcMar>
-            <w:vAlign w:val="center"/>
-          </w:tcPr>
-          <w:p>
-            <w:pPr>
-              <w:jc w:val="center"/>
-            </w:pPr>
-            <w:r>
-              <w:rPr>
-                <w:b/>
-                <w:bCs/>
-                <w:color w:val="777777"/>
-                <w:sz w:val="20"/>
-                <w:szCs w:val="20"/>
-              </w:rPr>
-              <w:t xml:space="preserve">[ INSEREZ ICI VOTRE CAPTURE D'ECRAN ]</w:t>
-            </w:r>
-          </w:p>
-          <w:p>
-            <w:pPr>
-              <w:jc w:val="center"/>
-            </w:pPr>
-            <w:r>
-              <w:rPr>
-                <w:i/>
-                <w:iCs/>
-                <w:color w:val="555555"/>
-                <w:sz w:val="20"/>
-                <w:szCs w:val="20"/>
-              </w:rPr>
-              <w:t xml:space="preserve">Figure 6 : Profil air SAIN - OLED + LED verte (Wokwi)</w:t>
-            </w:r>
-          </w:p>
-        </w:tc>
-      </w:tr>
-    </w:tbl>
+    <w:p>
+      <w:pPr>
+        <w:spacing w:after="60"/>
+        <w:jc w:val="center"/>
+      </w:pPr>
+      <w:r>
+        <w:drawing>
+          <wp:inline distT="0" distB="0" distL="0" distR="0">
+            <wp:extent cx="5715000" cy="4905375"/>
+            <wp:effectExtent t="0" r="0" b="0" l="0"/>
+            <wp:docPr id="1" name="fig6_sain.png" descr="Figure 6 : Profil air SAIN - OLED + LED verte (Wokwi)" title="Figure 6 : Profil air SAIN - OLED + LED verte (Wokwi)"/>
+            <wp:cNvGraphicFramePr>
+              <a:graphicFrameLocks xmlns:a="http://schemas.openxmlformats.org/drawingml/2006/main" noChangeAspect="1"/>
+            </wp:cNvGraphicFramePr>
+            <a:graphic xmlns:a="http://schemas.openxmlformats.org/drawingml/2006/main">
+              <a:graphicData uri="http://schemas.openxmlformats.org/drawingml/2006/picture">
+                <pic:pic xmlns:pic="http://schemas.openxmlformats.org/drawingml/2006/picture">
+                  <pic:nvPicPr>
+                    <pic:cNvPr id="0" name="" descr=""/>
+                    <pic:cNvPicPr>
+                      <a:picLocks noChangeAspect="1" noChangeArrowheads="1"/>
+                    </pic:cNvPicPr>
+                  </pic:nvPicPr>
+                  <pic:blipFill>
+                    <a:blip r:embed="rId13" cstate="none"/>
+                    <a:srcRect/>
+                    <a:stretch>
+                      <a:fillRect/>
+                    </a:stretch>
+                  </pic:blipFill>
+                  <pic:spPr bwMode="auto">
+                    <a:xfrm>
+                      <a:off x="0" y="0"/>
+                      <a:ext cx="5715000" cy="4905375"/>
+                    </a:xfrm>
+                    <a:prstGeom prst="rect">
+                      <a:avLst/>
+                    </a:prstGeom>
+                  </pic:spPr>
+                </pic:pic>
+              </a:graphicData>
+            </a:graphic>
+          </wp:inline>
+        </w:drawing>
+      </w:r>
+    </w:p>
+    <w:p>
+      <w:r>
+        <w:t xml:space="preserve"/>
+      </w:r>
+    </w:p>
+    <w:p>
+      <w:pPr>
+        <w:spacing w:after="60"/>
+        <w:jc w:val="center"/>
+      </w:pPr>
+      <w:r>
+        <w:drawing>
+          <wp:inline distT="0" distB="0" distL="0" distR="0">
+            <wp:extent cx="5715000" cy="5276850"/>
+            <wp:effectExtent t="0" r="0" b="0" l="0"/>
+            <wp:docPr id="1" name="fig7_modere.png" descr="Figure 7 : Profil air MODERE - OLED + LED orange (Wokwi)" title="Figure 7 : Profil air MODERE - OLED + LED orange (Wokwi)"/>
+            <wp:cNvGraphicFramePr>
+              <a:graphicFrameLocks xmlns:a="http://schemas.openxmlformats.org/drawingml/2006/main" noChangeAspect="1"/>
+            </wp:cNvGraphicFramePr>
+            <a:graphic xmlns:a="http://schemas.openxmlformats.org/drawingml/2006/main">
+              <a:graphicData uri="http://schemas.openxmlformats.org/drawingml/2006/picture">
+                <pic:pic xmlns:pic="http://schemas.openxmlformats.org/drawingml/2006/picture">
+                  <pic:nvPicPr>
+                    <pic:cNvPr id="0" name="" descr=""/>
+                    <pic:cNvPicPr>
+                      <a:picLocks noChangeAspect="1" noChangeArrowheads="1"/>
+                    </pic:cNvPicPr>
+                  </pic:nvPicPr>
+                  <pic:blipFill>
+                    <a:blip r:embed="rId14" cstate="none"/>
+                    <a:srcRect/>
+                    <a:stretch>
+                      <a:fillRect/>
+                    </a:stretch>
+                  </pic:blipFill>
+                  <pic:spPr bwMode="auto">
+                    <a:xfrm>
+                      <a:off x="0" y="0"/>
+                      <a:ext cx="5715000" cy="5276850"/>
+                    </a:xfrm>
+                    <a:prstGeom prst="rect">
+                      <a:avLst/>
+                    </a:prstGeom>
+                  </pic:spPr>
+                </pic:pic>
+              </a:graphicData>
+            </a:graphic>
+          </wp:inline>
+        </w:drawing>
+      </w:r>
+    </w:p>
+    <w:p>
+      <w:r>
+        <w:t xml:space="preserve"/>
+      </w:r>
+    </w:p>
+    <w:p>
+      <w:pPr>
+        <w:spacing w:after="60"/>
+        <w:jc w:val="center"/>
+      </w:pPr>
+      <w:r>
+        <w:drawing>
+          <wp:inline distT="0" distB="0" distL="0" distR="0">
+            <wp:extent cx="5715000" cy="4905375"/>
+            <wp:effectExtent t="0" r="0" b="0" l="0"/>
+            <wp:docPr id="1" name="fig8_pollue.png" descr="Figure 8 : Profil air POLLUE - OLED + LED rouge + buzzer (Wokwi)" title="Figure 8 : Profil air POLLUE - OLED + LED rouge + buzzer (Wokwi)"/>
+            <wp:cNvGraphicFramePr>
+              <a:graphicFrameLocks xmlns:a="http://schemas.openxmlformats.org/drawingml/2006/main" noChangeAspect="1"/>
+            </wp:cNvGraphicFramePr>
+            <a:graphic xmlns:a="http://schemas.openxmlformats.org/drawingml/2006/main">
+              <a:graphicData uri="http://schemas.openxmlformats.org/drawingml/2006/picture">
+                <pic:pic xmlns:pic="http://schemas.openxmlformats.org/drawingml/2006/picture">
+                  <pic:nvPicPr>
+                    <pic:cNvPr id="0" name="" descr=""/>
+                    <pic:cNvPicPr>
+                      <a:picLocks noChangeAspect="1" noChangeArrowheads="1"/>
+                    </pic:cNvPicPr>
+                  </pic:nvPicPr>
+                  <pic:blipFill>
+                    <a:blip r:embed="rId15" cstate="none"/>
+                    <a:srcRect/>
+                    <a:stretch>
+                      <a:fillRect/>
+                    </a:stretch>
+                  </pic:blipFill>
+                  <pic:spPr bwMode="auto">
+                    <a:xfrm>
+                      <a:off x="0" y="0"/>
+                      <a:ext cx="5715000" cy="4905375"/>
+                    </a:xfrm>
+                    <a:prstGeom prst="rect">
+                      <a:avLst/>
+                    </a:prstGeom>
+                  </pic:spPr>
+                </pic:pic>
+              </a:graphicData>
+            </a:graphic>
+          </wp:inline>
+        </w:drawing>
+      </w:r>
+    </w:p>
     <w:p>
       <w:r>
         <w:t xml:space="preserve"/>
@@ -8576,150 +8636,6 @@
                 <w:sz w:val="20"/>
                 <w:szCs w:val="20"/>
               </w:rPr>
-              <w:t xml:space="preserve">Figure 7 : Profil air MODERE - OLED + LED orange (Wokwi)</w:t>
-            </w:r>
-          </w:p>
-        </w:tc>
-      </w:tr>
-    </w:tbl>
-    <w:p>
-      <w:r>
-        <w:t xml:space="preserve"/>
-      </w:r>
-    </w:p>
-    <w:tbl>
-      <w:tblPr>
-        <w:tblW w:type="dxa" w:w="9360"/>
-        <w:tblBorders>
-          <w:top w:val="single" w:color="auto" w:sz="4"/>
-          <w:left w:val="single" w:color="auto" w:sz="4"/>
-          <w:bottom w:val="single" w:color="auto" w:sz="4"/>
-          <w:right w:val="single" w:color="auto" w:sz="4"/>
-          <w:insideH w:val="single" w:color="auto" w:sz="4"/>
-          <w:insideV w:val="single" w:color="auto" w:sz="4"/>
-        </w:tblBorders>
-      </w:tblPr>
-      <w:tblGrid>
-        <w:gridCol w:w="9360"/>
-      </w:tblGrid>
-      <w:tr>
-        <w:tc>
-          <w:tcPr>
-            <w:tcW w:type="dxa" w:w="9360"/>
-            <w:tcBorders>
-              <w:top w:val="dashed" w:color="888888" w:sz="1"/>
-              <w:left w:val="dashed" w:color="888888" w:sz="1"/>
-              <w:bottom w:val="dashed" w:color="888888" w:sz="1"/>
-              <w:right w:val="dashed" w:color="888888" w:sz="1"/>
-            </w:tcBorders>
-            <w:shd w:fill="F0F0F0" w:val="clear"/>
-            <w:tcMar>
-              <w:top w:type="dxa" w:w="400"/>
-              <w:left w:type="dxa" w:w="120"/>
-              <w:bottom w:type="dxa" w:w="400"/>
-              <w:right w:type="dxa" w:w="120"/>
-            </w:tcMar>
-            <w:vAlign w:val="center"/>
-          </w:tcPr>
-          <w:p>
-            <w:pPr>
-              <w:jc w:val="center"/>
-            </w:pPr>
-            <w:r>
-              <w:rPr>
-                <w:b/>
-                <w:bCs/>
-                <w:color w:val="777777"/>
-                <w:sz w:val="20"/>
-                <w:szCs w:val="20"/>
-              </w:rPr>
-              <w:t xml:space="preserve">[ INSEREZ ICI VOTRE CAPTURE D'ECRAN ]</w:t>
-            </w:r>
-          </w:p>
-          <w:p>
-            <w:pPr>
-              <w:jc w:val="center"/>
-            </w:pPr>
-            <w:r>
-              <w:rPr>
-                <w:i/>
-                <w:iCs/>
-                <w:color w:val="555555"/>
-                <w:sz w:val="20"/>
-                <w:szCs w:val="20"/>
-              </w:rPr>
-              <w:t xml:space="preserve">Figure 8 : Profil air POLLUE - OLED + LED rouge + buzzer (Wokwi)</w:t>
-            </w:r>
-          </w:p>
-        </w:tc>
-      </w:tr>
-    </w:tbl>
-    <w:p>
-      <w:r>
-        <w:t xml:space="preserve"/>
-      </w:r>
-    </w:p>
-    <w:tbl>
-      <w:tblPr>
-        <w:tblW w:type="dxa" w:w="9360"/>
-        <w:tblBorders>
-          <w:top w:val="single" w:color="auto" w:sz="4"/>
-          <w:left w:val="single" w:color="auto" w:sz="4"/>
-          <w:bottom w:val="single" w:color="auto" w:sz="4"/>
-          <w:right w:val="single" w:color="auto" w:sz="4"/>
-          <w:insideH w:val="single" w:color="auto" w:sz="4"/>
-          <w:insideV w:val="single" w:color="auto" w:sz="4"/>
-        </w:tblBorders>
-      </w:tblPr>
-      <w:tblGrid>
-        <w:gridCol w:w="9360"/>
-      </w:tblGrid>
-      <w:tr>
-        <w:tc>
-          <w:tcPr>
-            <w:tcW w:type="dxa" w:w="9360"/>
-            <w:tcBorders>
-              <w:top w:val="dashed" w:color="888888" w:sz="1"/>
-              <w:left w:val="dashed" w:color="888888" w:sz="1"/>
-              <w:bottom w:val="dashed" w:color="888888" w:sz="1"/>
-              <w:right w:val="dashed" w:color="888888" w:sz="1"/>
-            </w:tcBorders>
-            <w:shd w:fill="F0F0F0" w:val="clear"/>
-            <w:tcMar>
-              <w:top w:type="dxa" w:w="400"/>
-              <w:left w:type="dxa" w:w="120"/>
-              <w:bottom w:type="dxa" w:w="400"/>
-              <w:right w:type="dxa" w:w="120"/>
-            </w:tcMar>
-            <w:vAlign w:val="center"/>
-          </w:tcPr>
-          <w:p>
-            <w:pPr>
-              <w:jc w:val="center"/>
-            </w:pPr>
-            <w:r>
-              <w:rPr>
-                <w:b/>
-                <w:bCs/>
-                <w:color w:val="777777"/>
-                <w:sz w:val="20"/>
-                <w:szCs w:val="20"/>
-              </w:rPr>
-              <w:t xml:space="preserve">[ INSEREZ ICI VOTRE CAPTURE D'ECRAN ]</w:t>
-            </w:r>
-          </w:p>
-          <w:p>
-            <w:pPr>
-              <w:jc w:val="center"/>
-            </w:pPr>
-            <w:r>
-              <w:rPr>
-                <w:i/>
-                <w:iCs/>
-                <w:color w:val="555555"/>
-                <w:sz w:val="20"/>
-                <w:szCs w:val="20"/>
-              </w:rPr>
               <w:t xml:space="preserve">Figure 9 : Moniteur serie (valeurs des capteurs et indice)</w:t>
             </w:r>
           </w:p>
@@ -8929,7 +8845,7 @@
         </w:rPr>
         <w:t xml:space="preserve">Simulation Wokwi : </w:t>
       </w:r>
-      <w:hyperlink w:history="1" r:id="rIdmcyeki4yeh9uekenbkdrs">
+      <w:hyperlink w:history="1" r:id="rIdkg1qzckb02_fqhwfsr3sp">
         <w:r>
           <w:rPr>
             <w:rStyle w:val="Hyperlink"/>
@@ -8953,7 +8869,7 @@
         </w:rPr>
         <w:t xml:space="preserve">Depot Git : </w:t>
       </w:r>
-      <w:hyperlink w:history="1" r:id="rIdq9xn58a67mtlr4sceq3gz">
+      <w:hyperlink w:history="1" r:id="rIdjxxpkgmqktnux-edx1yas">
         <w:r>
           <w:rPr>
             <w:rStyle w:val="Hyperlink"/>

</xml_diff>

<commit_message>
Rapport: ajout des noms du groupe + version PDF
</commit_message>
<xml_diff>
--- a/Rapport_Projet5_Qualite_Air.docx
+++ b/Rapport_Projet5_Qualite_Air.docx
@@ -401,7 +401,62 @@
     </w:tbl>
     <w:p>
       <w:pPr>
-        <w:spacing w:before="1200"/>
+        <w:spacing w:after="100" w:before="700"/>
+        <w:jc w:val="center"/>
+      </w:pPr>
+      <w:r>
+        <w:rPr>
+          <w:b/>
+          <w:bCs/>
+          <w:color w:val="2E5C8A"/>
+          <w:sz w:val="26"/>
+          <w:szCs w:val="26"/>
+        </w:rPr>
+        <w:t xml:space="preserve">Realise par :</w:t>
+      </w:r>
+    </w:p>
+    <w:p>
+      <w:pPr>
+        <w:spacing w:after="40"/>
+        <w:jc w:val="center"/>
+      </w:pPr>
+      <w:r>
+        <w:rPr>
+          <w:sz w:val="24"/>
+          <w:szCs w:val="24"/>
+        </w:rPr>
+        <w:t xml:space="preserve">Mohamed El Haimer</w:t>
+      </w:r>
+    </w:p>
+    <w:p>
+      <w:pPr>
+        <w:spacing w:after="40"/>
+        <w:jc w:val="center"/>
+      </w:pPr>
+      <w:r>
+        <w:rPr>
+          <w:sz w:val="24"/>
+          <w:szCs w:val="24"/>
+        </w:rPr>
+        <w:t xml:space="preserve">El Ouazzani Mehdi Rayane</w:t>
+      </w:r>
+    </w:p>
+    <w:p>
+      <w:pPr>
+        <w:spacing w:after="40"/>
+        <w:jc w:val="center"/>
+      </w:pPr>
+      <w:r>
+        <w:rPr>
+          <w:sz w:val="24"/>
+          <w:szCs w:val="24"/>
+        </w:rPr>
+        <w:t xml:space="preserve">Ilias Jebrane</w:t>
+      </w:r>
+    </w:p>
+    <w:p>
+      <w:pPr>
+        <w:spacing w:before="500"/>
         <w:jc w:val="center"/>
       </w:pPr>
       <w:r>
@@ -8845,7 +8900,7 @@
         </w:rPr>
         <w:t xml:space="preserve">Simulation Wokwi : </w:t>
       </w:r>
-      <w:hyperlink w:history="1" r:id="rIdkg1qzckb02_fqhwfsr3sp">
+      <w:hyperlink w:history="1" r:id="rIdbkj7qsywlam8syt81npfu">
         <w:r>
           <w:rPr>
             <w:rStyle w:val="Hyperlink"/>
@@ -8869,7 +8924,7 @@
         </w:rPr>
         <w:t xml:space="preserve">Depot Git : </w:t>
       </w:r>
-      <w:hyperlink w:history="1" r:id="rIdjxxpkgmqktnux-edx1yas">
+      <w:hyperlink w:history="1" r:id="rIdaskbztv5ofbo4ny5dvcby">
         <w:r>
           <w:rPr>
             <w:rStyle w:val="Hyperlink"/>

</xml_diff>

<commit_message>
Rapport: ajout du schema fonctionnel (Figure 1)
</commit_message>
<xml_diff>
--- a/Rapport_Projet5_Qualite_Air.docx
+++ b/Rapport_Projet5_Qualite_Air.docx
@@ -1205,1671 +1205,6 @@
         <w:t xml:space="preserve">DHT22 + Potentiometre + NTC  -&gt;  ESP32  -&gt;  OLED + LEDs + Buzzer  +  Blynk (Wi-Fi)</w:t>
       </w:r>
     </w:p>
-    <w:tbl>
-      <w:tblPr>
-        <w:tblW w:type="dxa" w:w="9360"/>
-        <w:tblBorders>
-          <w:top w:val="single" w:color="auto" w:sz="4"/>
-          <w:left w:val="single" w:color="auto" w:sz="4"/>
-          <w:bottom w:val="single" w:color="auto" w:sz="4"/>
-          <w:right w:val="single" w:color="auto" w:sz="4"/>
-          <w:insideH w:val="single" w:color="auto" w:sz="4"/>
-          <w:insideV w:val="single" w:color="auto" w:sz="4"/>
-        </w:tblBorders>
-      </w:tblPr>
-      <w:tblGrid>
-        <w:gridCol w:w="9360"/>
-      </w:tblGrid>
-      <w:tr>
-        <w:tc>
-          <w:tcPr>
-            <w:tcW w:type="dxa" w:w="9360"/>
-            <w:tcBorders>
-              <w:top w:val="dashed" w:color="888888" w:sz="1"/>
-              <w:left w:val="dashed" w:color="888888" w:sz="1"/>
-              <w:bottom w:val="dashed" w:color="888888" w:sz="1"/>
-              <w:right w:val="dashed" w:color="888888" w:sz="1"/>
-            </w:tcBorders>
-            <w:shd w:fill="F0F0F0" w:val="clear"/>
-            <w:tcMar>
-              <w:top w:type="dxa" w:w="400"/>
-              <w:left w:type="dxa" w:w="120"/>
-              <w:bottom w:type="dxa" w:w="400"/>
-              <w:right w:type="dxa" w:w="120"/>
-            </w:tcMar>
-            <w:vAlign w:val="center"/>
-          </w:tcPr>
-          <w:p>
-            <w:pPr>
-              <w:jc w:val="center"/>
-            </w:pPr>
-            <w:r>
-              <w:rPr>
-                <w:b/>
-                <w:bCs/>
-                <w:color w:val="777777"/>
-                <w:sz w:val="20"/>
-                <w:szCs w:val="20"/>
-              </w:rPr>
-              <w:t xml:space="preserve">[ INSEREZ ICI VOTRE CAPTURE D'ECRAN ]</w:t>
-            </w:r>
-          </w:p>
-          <w:p>
-            <w:pPr>
-              <w:jc w:val="center"/>
-            </w:pPr>
-            <w:r>
-              <w:rPr>
-                <w:i/>
-                <w:iCs/>
-                <w:color w:val="555555"/>
-                <w:sz w:val="20"/>
-                <w:szCs w:val="20"/>
-              </w:rPr>
-              <w:t xml:space="preserve">Figure 1 : Schema fonctionnel (entrees / traitement / sorties / Blynk)</w:t>
-            </w:r>
-          </w:p>
-        </w:tc>
-      </w:tr>
-    </w:tbl>
-    <w:p>
-      <w:r>
-        <w:br w:type="page"/>
-      </w:r>
-    </w:p>
-    <w:p>
-      <w:pPr>
-        <w:pStyle w:val="Heading1"/>
-      </w:pPr>
-      <w:r>
-        <w:t xml:space="preserve">3. Liste des composants (BOM) et justification</w:t>
-      </w:r>
-    </w:p>
-    <w:tbl>
-      <w:tblPr>
-        <w:tblW w:type="dxa" w:w="9360"/>
-        <w:tblBorders>
-          <w:top w:val="single" w:color="auto" w:sz="4"/>
-          <w:left w:val="single" w:color="auto" w:sz="4"/>
-          <w:bottom w:val="single" w:color="auto" w:sz="4"/>
-          <w:right w:val="single" w:color="auto" w:sz="4"/>
-          <w:insideH w:val="single" w:color="auto" w:sz="4"/>
-          <w:insideV w:val="single" w:color="auto" w:sz="4"/>
-        </w:tblBorders>
-      </w:tblPr>
-      <w:tblGrid>
-        <w:gridCol w:w="2300"/>
-        <w:gridCol w:w="3000"/>
-        <w:gridCol w:w="4060"/>
-      </w:tblGrid>
-      <w:tr>
-        <w:trPr>
-          <w:tblHeader/>
-        </w:trPr>
-        <w:tc>
-          <w:tcPr>
-            <w:tcW w:type="dxa" w:w="2300"/>
-            <w:tcBorders>
-              <w:top w:val="single" w:color="BBBBBB" w:sz="1"/>
-              <w:left w:val="single" w:color="BBBBBB" w:sz="1"/>
-              <w:bottom w:val="single" w:color="BBBBBB" w:sz="1"/>
-              <w:right w:val="single" w:color="BBBBBB" w:sz="1"/>
-            </w:tcBorders>
-            <w:shd w:fill="2E5C8A" w:val="clear"/>
-            <w:tcMar>
-              <w:top w:type="dxa" w:w="80"/>
-              <w:left w:type="dxa" w:w="120"/>
-              <w:bottom w:type="dxa" w:w="80"/>
-              <w:right w:type="dxa" w:w="120"/>
-            </w:tcMar>
-          </w:tcPr>
-          <w:p>
-            <w:r>
-              <w:rPr>
-                <w:b/>
-                <w:bCs/>
-                <w:color w:val="FFFFFF"/>
-                <w:sz w:val="20"/>
-                <w:szCs w:val="20"/>
-              </w:rPr>
-              <w:t xml:space="preserve">Composant</w:t>
-            </w:r>
-          </w:p>
-        </w:tc>
-        <w:tc>
-          <w:tcPr>
-            <w:tcW w:type="dxa" w:w="3000"/>
-            <w:tcBorders>
-              <w:top w:val="single" w:color="BBBBBB" w:sz="1"/>
-              <w:left w:val="single" w:color="BBBBBB" w:sz="1"/>
-              <w:bottom w:val="single" w:color="BBBBBB" w:sz="1"/>
-              <w:right w:val="single" w:color="BBBBBB" w:sz="1"/>
-            </w:tcBorders>
-            <w:shd w:fill="2E5C8A" w:val="clear"/>
-            <w:tcMar>
-              <w:top w:type="dxa" w:w="80"/>
-              <w:left w:type="dxa" w:w="120"/>
-              <w:bottom w:type="dxa" w:w="80"/>
-              <w:right w:type="dxa" w:w="120"/>
-            </w:tcMar>
-          </w:tcPr>
-          <w:p>
-            <w:r>
-              <w:rPr>
-                <w:b/>
-                <w:bCs/>
-                <w:color w:val="FFFFFF"/>
-                <w:sz w:val="20"/>
-                <w:szCs w:val="20"/>
-              </w:rPr>
-              <w:t xml:space="preserve">Role dans le projet</w:t>
-            </w:r>
-          </w:p>
-        </w:tc>
-        <w:tc>
-          <w:tcPr>
-            <w:tcW w:type="dxa" w:w="4060"/>
-            <w:tcBorders>
-              <w:top w:val="single" w:color="BBBBBB" w:sz="1"/>
-              <w:left w:val="single" w:color="BBBBBB" w:sz="1"/>
-              <w:bottom w:val="single" w:color="BBBBBB" w:sz="1"/>
-              <w:right w:val="single" w:color="BBBBBB" w:sz="1"/>
-            </w:tcBorders>
-            <w:shd w:fill="2E5C8A" w:val="clear"/>
-            <w:tcMar>
-              <w:top w:type="dxa" w:w="80"/>
-              <w:left w:type="dxa" w:w="120"/>
-              <w:bottom w:type="dxa" w:w="80"/>
-              <w:right w:type="dxa" w:w="120"/>
-            </w:tcMar>
-          </w:tcPr>
-          <w:p>
-            <w:r>
-              <w:rPr>
-                <w:b/>
-                <w:bCs/>
-                <w:color w:val="FFFFFF"/>
-                <w:sz w:val="20"/>
-                <w:szCs w:val="20"/>
-              </w:rPr>
-              <w:t xml:space="preserve">Justification du choix</w:t>
-            </w:r>
-          </w:p>
-        </w:tc>
-      </w:tr>
-      <w:tr>
-        <w:tc>
-          <w:tcPr>
-            <w:tcW w:type="dxa" w:w="2300"/>
-            <w:tcBorders>
-              <w:top w:val="single" w:color="BBBBBB" w:sz="1"/>
-              <w:left w:val="single" w:color="BBBBBB" w:sz="1"/>
-              <w:bottom w:val="single" w:color="BBBBBB" w:sz="1"/>
-              <w:right w:val="single" w:color="BBBBBB" w:sz="1"/>
-            </w:tcBorders>
-            <w:shd w:fill="FFFFFF" w:val="clear"/>
-            <w:tcMar>
-              <w:top w:type="dxa" w:w="60"/>
-              <w:left w:type="dxa" w:w="120"/>
-              <w:bottom w:type="dxa" w:w="60"/>
-              <w:right w:type="dxa" w:w="120"/>
-            </w:tcMar>
-          </w:tcPr>
-          <w:p>
-            <w:r>
-              <w:rPr>
-                <w:sz w:val="19"/>
-                <w:szCs w:val="19"/>
-              </w:rPr>
-              <w:t xml:space="preserve">ESP32 DevKit C v4</w:t>
-            </w:r>
-          </w:p>
-        </w:tc>
-        <w:tc>
-          <w:tcPr>
-            <w:tcW w:type="dxa" w:w="3000"/>
-            <w:tcBorders>
-              <w:top w:val="single" w:color="BBBBBB" w:sz="1"/>
-              <w:left w:val="single" w:color="BBBBBB" w:sz="1"/>
-              <w:bottom w:val="single" w:color="BBBBBB" w:sz="1"/>
-              <w:right w:val="single" w:color="BBBBBB" w:sz="1"/>
-            </w:tcBorders>
-            <w:shd w:fill="FFFFFF" w:val="clear"/>
-            <w:tcMar>
-              <w:top w:type="dxa" w:w="60"/>
-              <w:left w:type="dxa" w:w="120"/>
-              <w:bottom w:type="dxa" w:w="60"/>
-              <w:right w:type="dxa" w:w="120"/>
-            </w:tcMar>
-          </w:tcPr>
-          <w:p>
-            <w:r>
-              <w:rPr>
-                <w:sz w:val="19"/>
-                <w:szCs w:val="19"/>
-              </w:rPr>
-              <w:t xml:space="preserve">Unite de traitement + Wi-Fi</w:t>
-            </w:r>
-          </w:p>
-        </w:tc>
-        <w:tc>
-          <w:tcPr>
-            <w:tcW w:type="dxa" w:w="4060"/>
-            <w:tcBorders>
-              <w:top w:val="single" w:color="BBBBBB" w:sz="1"/>
-              <w:left w:val="single" w:color="BBBBBB" w:sz="1"/>
-              <w:bottom w:val="single" w:color="BBBBBB" w:sz="1"/>
-              <w:right w:val="single" w:color="BBBBBB" w:sz="1"/>
-            </w:tcBorders>
-            <w:shd w:fill="FFFFFF" w:val="clear"/>
-            <w:tcMar>
-              <w:top w:type="dxa" w:w="60"/>
-              <w:left w:type="dxa" w:w="120"/>
-              <w:bottom w:type="dxa" w:w="60"/>
-              <w:right w:type="dxa" w:w="120"/>
-            </w:tcMar>
-          </w:tcPr>
-          <w:p>
-            <w:r>
-              <w:rPr>
-                <w:sz w:val="19"/>
-                <w:szCs w:val="19"/>
-              </w:rPr>
-              <w:t xml:space="preserve">Microcontroleur impose, Wi-Fi integre pour Blynk</w:t>
-            </w:r>
-          </w:p>
-        </w:tc>
-      </w:tr>
-      <w:tr>
-        <w:tc>
-          <w:tcPr>
-            <w:tcW w:type="dxa" w:w="2300"/>
-            <w:tcBorders>
-              <w:top w:val="single" w:color="BBBBBB" w:sz="1"/>
-              <w:left w:val="single" w:color="BBBBBB" w:sz="1"/>
-              <w:bottom w:val="single" w:color="BBBBBB" w:sz="1"/>
-              <w:right w:val="single" w:color="BBBBBB" w:sz="1"/>
-            </w:tcBorders>
-            <w:shd w:fill="EEF3F8" w:val="clear"/>
-            <w:tcMar>
-              <w:top w:type="dxa" w:w="60"/>
-              <w:left w:type="dxa" w:w="120"/>
-              <w:bottom w:type="dxa" w:w="60"/>
-              <w:right w:type="dxa" w:w="120"/>
-            </w:tcMar>
-          </w:tcPr>
-          <w:p>
-            <w:r>
-              <w:rPr>
-                <w:sz w:val="19"/>
-                <w:szCs w:val="19"/>
-              </w:rPr>
-              <w:t xml:space="preserve">DHT22</w:t>
-            </w:r>
-          </w:p>
-        </w:tc>
-        <w:tc>
-          <w:tcPr>
-            <w:tcW w:type="dxa" w:w="3000"/>
-            <w:tcBorders>
-              <w:top w:val="single" w:color="BBBBBB" w:sz="1"/>
-              <w:left w:val="single" w:color="BBBBBB" w:sz="1"/>
-              <w:bottom w:val="single" w:color="BBBBBB" w:sz="1"/>
-              <w:right w:val="single" w:color="BBBBBB" w:sz="1"/>
-            </w:tcBorders>
-            <w:shd w:fill="EEF3F8" w:val="clear"/>
-            <w:tcMar>
-              <w:top w:type="dxa" w:w="60"/>
-              <w:left w:type="dxa" w:w="120"/>
-              <w:bottom w:type="dxa" w:w="60"/>
-              <w:right w:type="dxa" w:w="120"/>
-            </w:tcMar>
-          </w:tcPr>
-          <w:p>
-            <w:r>
-              <w:rPr>
-                <w:sz w:val="19"/>
-                <w:szCs w:val="19"/>
-              </w:rPr>
-              <w:t xml:space="preserve">Temperature + humidite</w:t>
-            </w:r>
-          </w:p>
-        </w:tc>
-        <w:tc>
-          <w:tcPr>
-            <w:tcW w:type="dxa" w:w="4060"/>
-            <w:tcBorders>
-              <w:top w:val="single" w:color="BBBBBB" w:sz="1"/>
-              <w:left w:val="single" w:color="BBBBBB" w:sz="1"/>
-              <w:bottom w:val="single" w:color="BBBBBB" w:sz="1"/>
-              <w:right w:val="single" w:color="BBBBBB" w:sz="1"/>
-            </w:tcBorders>
-            <w:shd w:fill="EEF3F8" w:val="clear"/>
-            <w:tcMar>
-              <w:top w:type="dxa" w:w="60"/>
-              <w:left w:type="dxa" w:w="120"/>
-              <w:bottom w:type="dxa" w:w="60"/>
-              <w:right w:type="dxa" w:w="120"/>
-            </w:tcMar>
-          </w:tcPr>
-          <w:p>
-            <w:r>
-              <w:rPr>
-                <w:sz w:val="19"/>
-                <w:szCs w:val="19"/>
-              </w:rPr>
-              <w:t xml:space="preserve">Capteur natif Wokwi, mesure les 2 grandeurs cles</w:t>
-            </w:r>
-          </w:p>
-        </w:tc>
-      </w:tr>
-      <w:tr>
-        <w:tc>
-          <w:tcPr>
-            <w:tcW w:type="dxa" w:w="2300"/>
-            <w:tcBorders>
-              <w:top w:val="single" w:color="BBBBBB" w:sz="1"/>
-              <w:left w:val="single" w:color="BBBBBB" w:sz="1"/>
-              <w:bottom w:val="single" w:color="BBBBBB" w:sz="1"/>
-              <w:right w:val="single" w:color="BBBBBB" w:sz="1"/>
-            </w:tcBorders>
-            <w:shd w:fill="FFFFFF" w:val="clear"/>
-            <w:tcMar>
-              <w:top w:type="dxa" w:w="60"/>
-              <w:left w:type="dxa" w:w="120"/>
-              <w:bottom w:type="dxa" w:w="60"/>
-              <w:right w:type="dxa" w:w="120"/>
-            </w:tcMar>
-          </w:tcPr>
-          <w:p>
-            <w:r>
-              <w:rPr>
-                <w:sz w:val="19"/>
-                <w:szCs w:val="19"/>
-              </w:rPr>
-              <w:t xml:space="preserve">Potentiometre</w:t>
-            </w:r>
-          </w:p>
-        </w:tc>
-        <w:tc>
-          <w:tcPr>
-            <w:tcW w:type="dxa" w:w="3000"/>
-            <w:tcBorders>
-              <w:top w:val="single" w:color="BBBBBB" w:sz="1"/>
-              <w:left w:val="single" w:color="BBBBBB" w:sz="1"/>
-              <w:bottom w:val="single" w:color="BBBBBB" w:sz="1"/>
-              <w:right w:val="single" w:color="BBBBBB" w:sz="1"/>
-            </w:tcBorders>
-            <w:shd w:fill="FFFFFF" w:val="clear"/>
-            <w:tcMar>
-              <w:top w:type="dxa" w:w="60"/>
-              <w:left w:type="dxa" w:w="120"/>
-              <w:bottom w:type="dxa" w:w="60"/>
-              <w:right w:type="dxa" w:w="120"/>
-            </w:tcMar>
-          </w:tcPr>
-          <w:p>
-            <w:r>
-              <w:rPr>
-                <w:sz w:val="19"/>
-                <w:szCs w:val="19"/>
-              </w:rPr>
-              <w:t xml:space="preserve">Indice CO2/COV simule</w:t>
-            </w:r>
-          </w:p>
-        </w:tc>
-        <w:tc>
-          <w:tcPr>
-            <w:tcW w:type="dxa" w:w="4060"/>
-            <w:tcBorders>
-              <w:top w:val="single" w:color="BBBBBB" w:sz="1"/>
-              <w:left w:val="single" w:color="BBBBBB" w:sz="1"/>
-              <w:bottom w:val="single" w:color="BBBBBB" w:sz="1"/>
-              <w:right w:val="single" w:color="BBBBBB" w:sz="1"/>
-            </w:tcBorders>
-            <w:shd w:fill="FFFFFF" w:val="clear"/>
-            <w:tcMar>
-              <w:top w:type="dxa" w:w="60"/>
-              <w:left w:type="dxa" w:w="120"/>
-              <w:bottom w:type="dxa" w:w="60"/>
-              <w:right w:type="dxa" w:w="120"/>
-            </w:tcMar>
-          </w:tcPr>
-          <w:p>
-            <w:r>
-              <w:rPr>
-                <w:sz w:val="19"/>
-                <w:szCs w:val="19"/>
-              </w:rPr>
-              <w:t xml:space="preserve">Simule un capteur analogique absent de Wokwi</w:t>
-            </w:r>
-          </w:p>
-        </w:tc>
-      </w:tr>
-      <w:tr>
-        <w:tc>
-          <w:tcPr>
-            <w:tcW w:type="dxa" w:w="2300"/>
-            <w:tcBorders>
-              <w:top w:val="single" w:color="BBBBBB" w:sz="1"/>
-              <w:left w:val="single" w:color="BBBBBB" w:sz="1"/>
-              <w:bottom w:val="single" w:color="BBBBBB" w:sz="1"/>
-              <w:right w:val="single" w:color="BBBBBB" w:sz="1"/>
-            </w:tcBorders>
-            <w:shd w:fill="EEF3F8" w:val="clear"/>
-            <w:tcMar>
-              <w:top w:type="dxa" w:w="60"/>
-              <w:left w:type="dxa" w:w="120"/>
-              <w:bottom w:type="dxa" w:w="60"/>
-              <w:right w:type="dxa" w:w="120"/>
-            </w:tcMar>
-          </w:tcPr>
-          <w:p>
-            <w:r>
-              <w:rPr>
-                <w:sz w:val="19"/>
-                <w:szCs w:val="19"/>
-              </w:rPr>
-              <w:t xml:space="preserve">NTC thermistor</w:t>
-            </w:r>
-          </w:p>
-        </w:tc>
-        <w:tc>
-          <w:tcPr>
-            <w:tcW w:type="dxa" w:w="3000"/>
-            <w:tcBorders>
-              <w:top w:val="single" w:color="BBBBBB" w:sz="1"/>
-              <w:left w:val="single" w:color="BBBBBB" w:sz="1"/>
-              <w:bottom w:val="single" w:color="BBBBBB" w:sz="1"/>
-              <w:right w:val="single" w:color="BBBBBB" w:sz="1"/>
-            </w:tcBorders>
-            <w:shd w:fill="EEF3F8" w:val="clear"/>
-            <w:tcMar>
-              <w:top w:type="dxa" w:w="60"/>
-              <w:left w:type="dxa" w:w="120"/>
-              <w:bottom w:type="dxa" w:w="60"/>
-              <w:right w:type="dxa" w:w="120"/>
-            </w:tcMar>
-          </w:tcPr>
-          <w:p>
-            <w:r>
-              <w:rPr>
-                <w:sz w:val="19"/>
-                <w:szCs w:val="19"/>
-              </w:rPr>
-              <w:t xml:space="preserve">Temperature secondaire</w:t>
-            </w:r>
-          </w:p>
-        </w:tc>
-        <w:tc>
-          <w:tcPr>
-            <w:tcW w:type="dxa" w:w="4060"/>
-            <w:tcBorders>
-              <w:top w:val="single" w:color="BBBBBB" w:sz="1"/>
-              <w:left w:val="single" w:color="BBBBBB" w:sz="1"/>
-              <w:bottom w:val="single" w:color="BBBBBB" w:sz="1"/>
-              <w:right w:val="single" w:color="BBBBBB" w:sz="1"/>
-            </w:tcBorders>
-            <w:shd w:fill="EEF3F8" w:val="clear"/>
-            <w:tcMar>
-              <w:top w:type="dxa" w:w="60"/>
-              <w:left w:type="dxa" w:w="120"/>
-              <w:bottom w:type="dxa" w:w="60"/>
-              <w:right w:type="dxa" w:w="120"/>
-            </w:tcMar>
-          </w:tcPr>
-          <w:p>
-            <w:r>
-              <w:rPr>
-                <w:sz w:val="19"/>
-                <w:szCs w:val="19"/>
-              </w:rPr>
-              <w:t xml:space="preserve">Controle croise de la temperature (redondance)</w:t>
-            </w:r>
-          </w:p>
-        </w:tc>
-      </w:tr>
-      <w:tr>
-        <w:tc>
-          <w:tcPr>
-            <w:tcW w:type="dxa" w:w="2300"/>
-            <w:tcBorders>
-              <w:top w:val="single" w:color="BBBBBB" w:sz="1"/>
-              <w:left w:val="single" w:color="BBBBBB" w:sz="1"/>
-              <w:bottom w:val="single" w:color="BBBBBB" w:sz="1"/>
-              <w:right w:val="single" w:color="BBBBBB" w:sz="1"/>
-            </w:tcBorders>
-            <w:shd w:fill="FFFFFF" w:val="clear"/>
-            <w:tcMar>
-              <w:top w:type="dxa" w:w="60"/>
-              <w:left w:type="dxa" w:w="120"/>
-              <w:bottom w:type="dxa" w:w="60"/>
-              <w:right w:type="dxa" w:w="120"/>
-            </w:tcMar>
-          </w:tcPr>
-          <w:p>
-            <w:r>
-              <w:rPr>
-                <w:sz w:val="19"/>
-                <w:szCs w:val="19"/>
-              </w:rPr>
-              <w:t xml:space="preserve">OLED SSD1306 I2C</w:t>
-            </w:r>
-          </w:p>
-        </w:tc>
-        <w:tc>
-          <w:tcPr>
-            <w:tcW w:type="dxa" w:w="3000"/>
-            <w:tcBorders>
-              <w:top w:val="single" w:color="BBBBBB" w:sz="1"/>
-              <w:left w:val="single" w:color="BBBBBB" w:sz="1"/>
-              <w:bottom w:val="single" w:color="BBBBBB" w:sz="1"/>
-              <w:right w:val="single" w:color="BBBBBB" w:sz="1"/>
-            </w:tcBorders>
-            <w:shd w:fill="FFFFFF" w:val="clear"/>
-            <w:tcMar>
-              <w:top w:type="dxa" w:w="60"/>
-              <w:left w:type="dxa" w:w="120"/>
-              <w:bottom w:type="dxa" w:w="60"/>
-              <w:right w:type="dxa" w:w="120"/>
-            </w:tcMar>
-          </w:tcPr>
-          <w:p>
-            <w:r>
-              <w:rPr>
-                <w:sz w:val="19"/>
-                <w:szCs w:val="19"/>
-              </w:rPr>
-              <w:t xml:space="preserve">Afficheur principal</w:t>
-            </w:r>
-          </w:p>
-        </w:tc>
-        <w:tc>
-          <w:tcPr>
-            <w:tcW w:type="dxa" w:w="4060"/>
-            <w:tcBorders>
-              <w:top w:val="single" w:color="BBBBBB" w:sz="1"/>
-              <w:left w:val="single" w:color="BBBBBB" w:sz="1"/>
-              <w:bottom w:val="single" w:color="BBBBBB" w:sz="1"/>
-              <w:right w:val="single" w:color="BBBBBB" w:sz="1"/>
-            </w:tcBorders>
-            <w:shd w:fill="FFFFFF" w:val="clear"/>
-            <w:tcMar>
-              <w:top w:type="dxa" w:w="60"/>
-              <w:left w:type="dxa" w:w="120"/>
-              <w:bottom w:type="dxa" w:w="60"/>
-              <w:right w:type="dxa" w:w="120"/>
-            </w:tcMar>
-          </w:tcPr>
-          <w:p>
-            <w:r>
-              <w:rPr>
-                <w:sz w:val="19"/>
-                <w:szCs w:val="19"/>
-              </w:rPr>
-              <w:t xml:space="preserve">Affichage multi-ecrans lisible, bus I2C</w:t>
-            </w:r>
-          </w:p>
-        </w:tc>
-      </w:tr>
-      <w:tr>
-        <w:tc>
-          <w:tcPr>
-            <w:tcW w:type="dxa" w:w="2300"/>
-            <w:tcBorders>
-              <w:top w:val="single" w:color="BBBBBB" w:sz="1"/>
-              <w:left w:val="single" w:color="BBBBBB" w:sz="1"/>
-              <w:bottom w:val="single" w:color="BBBBBB" w:sz="1"/>
-              <w:right w:val="single" w:color="BBBBBB" w:sz="1"/>
-            </w:tcBorders>
-            <w:shd w:fill="EEF3F8" w:val="clear"/>
-            <w:tcMar>
-              <w:top w:type="dxa" w:w="60"/>
-              <w:left w:type="dxa" w:w="120"/>
-              <w:bottom w:type="dxa" w:w="60"/>
-              <w:right w:type="dxa" w:w="120"/>
-            </w:tcMar>
-          </w:tcPr>
-          <w:p>
-            <w:r>
-              <w:rPr>
-                <w:sz w:val="19"/>
-                <w:szCs w:val="19"/>
-              </w:rPr>
-              <w:t xml:space="preserve">LED verte/orange/rouge</w:t>
-            </w:r>
-          </w:p>
-        </w:tc>
-        <w:tc>
-          <w:tcPr>
-            <w:tcW w:type="dxa" w:w="3000"/>
-            <w:tcBorders>
-              <w:top w:val="single" w:color="BBBBBB" w:sz="1"/>
-              <w:left w:val="single" w:color="BBBBBB" w:sz="1"/>
-              <w:bottom w:val="single" w:color="BBBBBB" w:sz="1"/>
-              <w:right w:val="single" w:color="BBBBBB" w:sz="1"/>
-            </w:tcBorders>
-            <w:shd w:fill="EEF3F8" w:val="clear"/>
-            <w:tcMar>
-              <w:top w:type="dxa" w:w="60"/>
-              <w:left w:type="dxa" w:w="120"/>
-              <w:bottom w:type="dxa" w:w="60"/>
-              <w:right w:type="dxa" w:w="120"/>
-            </w:tcMar>
-          </w:tcPr>
-          <w:p>
-            <w:r>
-              <w:rPr>
-                <w:sz w:val="19"/>
-                <w:szCs w:val="19"/>
-              </w:rPr>
-              <w:t xml:space="preserve">Signalisation des 3 etats</w:t>
-            </w:r>
-          </w:p>
-        </w:tc>
-        <w:tc>
-          <w:tcPr>
-            <w:tcW w:type="dxa" w:w="4060"/>
-            <w:tcBorders>
-              <w:top w:val="single" w:color="BBBBBB" w:sz="1"/>
-              <w:left w:val="single" w:color="BBBBBB" w:sz="1"/>
-              <w:bottom w:val="single" w:color="BBBBBB" w:sz="1"/>
-              <w:right w:val="single" w:color="BBBBBB" w:sz="1"/>
-            </w:tcBorders>
-            <w:shd w:fill="EEF3F8" w:val="clear"/>
-            <w:tcMar>
-              <w:top w:type="dxa" w:w="60"/>
-              <w:left w:type="dxa" w:w="120"/>
-              <w:bottom w:type="dxa" w:w="60"/>
-              <w:right w:type="dxa" w:w="120"/>
-            </w:tcMar>
-          </w:tcPr>
-          <w:p>
-            <w:r>
-              <w:rPr>
-                <w:sz w:val="19"/>
-                <w:szCs w:val="19"/>
-              </w:rPr>
-              <w:t xml:space="preserve">Indication visuelle immediate du niveau</w:t>
-            </w:r>
-          </w:p>
-        </w:tc>
-      </w:tr>
-      <w:tr>
-        <w:tc>
-          <w:tcPr>
-            <w:tcW w:type="dxa" w:w="2300"/>
-            <w:tcBorders>
-              <w:top w:val="single" w:color="BBBBBB" w:sz="1"/>
-              <w:left w:val="single" w:color="BBBBBB" w:sz="1"/>
-              <w:bottom w:val="single" w:color="BBBBBB" w:sz="1"/>
-              <w:right w:val="single" w:color="BBBBBB" w:sz="1"/>
-            </w:tcBorders>
-            <w:shd w:fill="FFFFFF" w:val="clear"/>
-            <w:tcMar>
-              <w:top w:type="dxa" w:w="60"/>
-              <w:left w:type="dxa" w:w="120"/>
-              <w:bottom w:type="dxa" w:w="60"/>
-              <w:right w:type="dxa" w:w="120"/>
-            </w:tcMar>
-          </w:tcPr>
-          <w:p>
-            <w:r>
-              <w:rPr>
-                <w:sz w:val="19"/>
-                <w:szCs w:val="19"/>
-              </w:rPr>
-              <w:t xml:space="preserve">Buzzer</w:t>
-            </w:r>
-          </w:p>
-        </w:tc>
-        <w:tc>
-          <w:tcPr>
-            <w:tcW w:type="dxa" w:w="3000"/>
-            <w:tcBorders>
-              <w:top w:val="single" w:color="BBBBBB" w:sz="1"/>
-              <w:left w:val="single" w:color="BBBBBB" w:sz="1"/>
-              <w:bottom w:val="single" w:color="BBBBBB" w:sz="1"/>
-              <w:right w:val="single" w:color="BBBBBB" w:sz="1"/>
-            </w:tcBorders>
-            <w:shd w:fill="FFFFFF" w:val="clear"/>
-            <w:tcMar>
-              <w:top w:type="dxa" w:w="60"/>
-              <w:left w:type="dxa" w:w="120"/>
-              <w:bottom w:type="dxa" w:w="60"/>
-              <w:right w:type="dxa" w:w="120"/>
-            </w:tcMar>
-          </w:tcPr>
-          <w:p>
-            <w:r>
-              <w:rPr>
-                <w:sz w:val="19"/>
-                <w:szCs w:val="19"/>
-              </w:rPr>
-              <w:t xml:space="preserve">Alerte sonore critique</w:t>
-            </w:r>
-          </w:p>
-        </w:tc>
-        <w:tc>
-          <w:tcPr>
-            <w:tcW w:type="dxa" w:w="4060"/>
-            <w:tcBorders>
-              <w:top w:val="single" w:color="BBBBBB" w:sz="1"/>
-              <w:left w:val="single" w:color="BBBBBB" w:sz="1"/>
-              <w:bottom w:val="single" w:color="BBBBBB" w:sz="1"/>
-              <w:right w:val="single" w:color="BBBBBB" w:sz="1"/>
-            </w:tcBorders>
-            <w:shd w:fill="FFFFFF" w:val="clear"/>
-            <w:tcMar>
-              <w:top w:type="dxa" w:w="60"/>
-              <w:left w:type="dxa" w:w="120"/>
-              <w:bottom w:type="dxa" w:w="60"/>
-              <w:right w:type="dxa" w:w="120"/>
-            </w:tcMar>
-          </w:tcPr>
-          <w:p>
-            <w:r>
-              <w:rPr>
-                <w:sz w:val="19"/>
-                <w:szCs w:val="19"/>
-              </w:rPr>
-              <w:t xml:space="preserve">Alerte active uniquement en etat pollue</w:t>
-            </w:r>
-          </w:p>
-        </w:tc>
-      </w:tr>
-      <w:tr>
-        <w:tc>
-          <w:tcPr>
-            <w:tcW w:type="dxa" w:w="2300"/>
-            <w:tcBorders>
-              <w:top w:val="single" w:color="BBBBBB" w:sz="1"/>
-              <w:left w:val="single" w:color="BBBBBB" w:sz="1"/>
-              <w:bottom w:val="single" w:color="BBBBBB" w:sz="1"/>
-              <w:right w:val="single" w:color="BBBBBB" w:sz="1"/>
-            </w:tcBorders>
-            <w:shd w:fill="EEF3F8" w:val="clear"/>
-            <w:tcMar>
-              <w:top w:type="dxa" w:w="60"/>
-              <w:left w:type="dxa" w:w="120"/>
-              <w:bottom w:type="dxa" w:w="60"/>
-              <w:right w:type="dxa" w:w="120"/>
-            </w:tcMar>
-          </w:tcPr>
-          <w:p>
-            <w:r>
-              <w:rPr>
-                <w:sz w:val="19"/>
-                <w:szCs w:val="19"/>
-              </w:rPr>
-              <w:t xml:space="preserve">3 resistances 220 Ohm</w:t>
-            </w:r>
-          </w:p>
-        </w:tc>
-        <w:tc>
-          <w:tcPr>
-            <w:tcW w:type="dxa" w:w="3000"/>
-            <w:tcBorders>
-              <w:top w:val="single" w:color="BBBBBB" w:sz="1"/>
-              <w:left w:val="single" w:color="BBBBBB" w:sz="1"/>
-              <w:bottom w:val="single" w:color="BBBBBB" w:sz="1"/>
-              <w:right w:val="single" w:color="BBBBBB" w:sz="1"/>
-            </w:tcBorders>
-            <w:shd w:fill="EEF3F8" w:val="clear"/>
-            <w:tcMar>
-              <w:top w:type="dxa" w:w="60"/>
-              <w:left w:type="dxa" w:w="120"/>
-              <w:bottom w:type="dxa" w:w="60"/>
-              <w:right w:type="dxa" w:w="120"/>
-            </w:tcMar>
-          </w:tcPr>
-          <w:p>
-            <w:r>
-              <w:rPr>
-                <w:sz w:val="19"/>
-                <w:szCs w:val="19"/>
-              </w:rPr>
-              <w:t xml:space="preserve">Protection des LEDs</w:t>
-            </w:r>
-          </w:p>
-        </w:tc>
-        <w:tc>
-          <w:tcPr>
-            <w:tcW w:type="dxa" w:w="4060"/>
-            <w:tcBorders>
-              <w:top w:val="single" w:color="BBBBBB" w:sz="1"/>
-              <w:left w:val="single" w:color="BBBBBB" w:sz="1"/>
-              <w:bottom w:val="single" w:color="BBBBBB" w:sz="1"/>
-              <w:right w:val="single" w:color="BBBBBB" w:sz="1"/>
-            </w:tcBorders>
-            <w:shd w:fill="EEF3F8" w:val="clear"/>
-            <w:tcMar>
-              <w:top w:type="dxa" w:w="60"/>
-              <w:left w:type="dxa" w:w="120"/>
-              <w:bottom w:type="dxa" w:w="60"/>
-              <w:right w:type="dxa" w:w="120"/>
-            </w:tcMar>
-          </w:tcPr>
-          <w:p>
-            <w:r>
-              <w:rPr>
-                <w:sz w:val="19"/>
-                <w:szCs w:val="19"/>
-              </w:rPr>
-              <w:t xml:space="preserve">Limitation du courant dans les LEDs</w:t>
-            </w:r>
-          </w:p>
-        </w:tc>
-      </w:tr>
-    </w:tbl>
-    <w:p>
-      <w:r>
-        <w:br w:type="page"/>
-      </w:r>
-    </w:p>
-    <w:p>
-      <w:pPr>
-        <w:pStyle w:val="Heading1"/>
-      </w:pPr>
-      <w:r>
-        <w:t xml:space="preserve">4. Cablage et affectation des broches</w:t>
-      </w:r>
-    </w:p>
-    <w:p>
-      <w:pPr>
-        <w:spacing w:after="120" w:line="276"/>
-        <w:jc w:val="both"/>
-      </w:pPr>
-      <w:r>
-        <w:rPr>
-          <w:sz w:val="22"/>
-          <w:szCs w:val="22"/>
-        </w:rPr>
-        <w:t xml:space="preserve">Le tableau ci-dessous resume les broches utilisees, conformes au cahier des charges.</w:t>
-      </w:r>
-    </w:p>
-    <w:tbl>
-      <w:tblPr>
-        <w:tblW w:type="dxa" w:w="9360"/>
-        <w:tblBorders>
-          <w:top w:val="single" w:color="auto" w:sz="4"/>
-          <w:left w:val="single" w:color="auto" w:sz="4"/>
-          <w:bottom w:val="single" w:color="auto" w:sz="4"/>
-          <w:right w:val="single" w:color="auto" w:sz="4"/>
-          <w:insideH w:val="single" w:color="auto" w:sz="4"/>
-          <w:insideV w:val="single" w:color="auto" w:sz="4"/>
-        </w:tblBorders>
-      </w:tblPr>
-      <w:tblGrid>
-        <w:gridCol w:w="3200"/>
-        <w:gridCol w:w="3160"/>
-        <w:gridCol w:w="3000"/>
-      </w:tblGrid>
-      <w:tr>
-        <w:trPr>
-          <w:tblHeader/>
-        </w:trPr>
-        <w:tc>
-          <w:tcPr>
-            <w:tcW w:type="dxa" w:w="3200"/>
-            <w:tcBorders>
-              <w:top w:val="single" w:color="BBBBBB" w:sz="1"/>
-              <w:left w:val="single" w:color="BBBBBB" w:sz="1"/>
-              <w:bottom w:val="single" w:color="BBBBBB" w:sz="1"/>
-              <w:right w:val="single" w:color="BBBBBB" w:sz="1"/>
-            </w:tcBorders>
-            <w:shd w:fill="2E5C8A" w:val="clear"/>
-            <w:tcMar>
-              <w:top w:type="dxa" w:w="80"/>
-              <w:left w:type="dxa" w:w="120"/>
-              <w:bottom w:type="dxa" w:w="80"/>
-              <w:right w:type="dxa" w:w="120"/>
-            </w:tcMar>
-          </w:tcPr>
-          <w:p>
-            <w:r>
-              <w:rPr>
-                <w:b/>
-                <w:bCs/>
-                <w:color w:val="FFFFFF"/>
-                <w:sz w:val="20"/>
-                <w:szCs w:val="20"/>
-              </w:rPr>
-              <w:t xml:space="preserve">Composant</w:t>
-            </w:r>
-          </w:p>
-        </w:tc>
-        <w:tc>
-          <w:tcPr>
-            <w:tcW w:type="dxa" w:w="3160"/>
-            <w:tcBorders>
-              <w:top w:val="single" w:color="BBBBBB" w:sz="1"/>
-              <w:left w:val="single" w:color="BBBBBB" w:sz="1"/>
-              <w:bottom w:val="single" w:color="BBBBBB" w:sz="1"/>
-              <w:right w:val="single" w:color="BBBBBB" w:sz="1"/>
-            </w:tcBorders>
-            <w:shd w:fill="2E5C8A" w:val="clear"/>
-            <w:tcMar>
-              <w:top w:type="dxa" w:w="80"/>
-              <w:left w:type="dxa" w:w="120"/>
-              <w:bottom w:type="dxa" w:w="80"/>
-              <w:right w:type="dxa" w:w="120"/>
-            </w:tcMar>
-          </w:tcPr>
-          <w:p>
-            <w:r>
-              <w:rPr>
-                <w:b/>
-                <w:bCs/>
-                <w:color w:val="FFFFFF"/>
-                <w:sz w:val="20"/>
-                <w:szCs w:val="20"/>
-              </w:rPr>
-              <w:t xml:space="preserve">Broche ESP32</w:t>
-            </w:r>
-          </w:p>
-        </w:tc>
-        <w:tc>
-          <w:tcPr>
-            <w:tcW w:type="dxa" w:w="3000"/>
-            <w:tcBorders>
-              <w:top w:val="single" w:color="BBBBBB" w:sz="1"/>
-              <w:left w:val="single" w:color="BBBBBB" w:sz="1"/>
-              <w:bottom w:val="single" w:color="BBBBBB" w:sz="1"/>
-              <w:right w:val="single" w:color="BBBBBB" w:sz="1"/>
-            </w:tcBorders>
-            <w:shd w:fill="2E5C8A" w:val="clear"/>
-            <w:tcMar>
-              <w:top w:type="dxa" w:w="80"/>
-              <w:left w:type="dxa" w:w="120"/>
-              <w:bottom w:type="dxa" w:w="80"/>
-              <w:right w:type="dxa" w:w="120"/>
-            </w:tcMar>
-          </w:tcPr>
-          <w:p>
-            <w:r>
-              <w:rPr>
-                <w:b/>
-                <w:bCs/>
-                <w:color w:val="FFFFFF"/>
-                <w:sz w:val="20"/>
-                <w:szCs w:val="20"/>
-              </w:rPr>
-              <w:t xml:space="preserve">Type</w:t>
-            </w:r>
-          </w:p>
-        </w:tc>
-      </w:tr>
-      <w:tr>
-        <w:tc>
-          <w:tcPr>
-            <w:tcW w:type="dxa" w:w="3200"/>
-            <w:tcBorders>
-              <w:top w:val="single" w:color="BBBBBB" w:sz="1"/>
-              <w:left w:val="single" w:color="BBBBBB" w:sz="1"/>
-              <w:bottom w:val="single" w:color="BBBBBB" w:sz="1"/>
-              <w:right w:val="single" w:color="BBBBBB" w:sz="1"/>
-            </w:tcBorders>
-            <w:shd w:fill="FFFFFF" w:val="clear"/>
-            <w:tcMar>
-              <w:top w:type="dxa" w:w="60"/>
-              <w:left w:type="dxa" w:w="120"/>
-              <w:bottom w:type="dxa" w:w="60"/>
-              <w:right w:type="dxa" w:w="120"/>
-            </w:tcMar>
-          </w:tcPr>
-          <w:p>
-            <w:r>
-              <w:rPr>
-                <w:sz w:val="19"/>
-                <w:szCs w:val="19"/>
-              </w:rPr>
-              <w:t xml:space="preserve">DHT22 (data)</w:t>
-            </w:r>
-          </w:p>
-        </w:tc>
-        <w:tc>
-          <w:tcPr>
-            <w:tcW w:type="dxa" w:w="3160"/>
-            <w:tcBorders>
-              <w:top w:val="single" w:color="BBBBBB" w:sz="1"/>
-              <w:left w:val="single" w:color="BBBBBB" w:sz="1"/>
-              <w:bottom w:val="single" w:color="BBBBBB" w:sz="1"/>
-              <w:right w:val="single" w:color="BBBBBB" w:sz="1"/>
-            </w:tcBorders>
-            <w:shd w:fill="FFFFFF" w:val="clear"/>
-            <w:tcMar>
-              <w:top w:type="dxa" w:w="60"/>
-              <w:left w:type="dxa" w:w="120"/>
-              <w:bottom w:type="dxa" w:w="60"/>
-              <w:right w:type="dxa" w:w="120"/>
-            </w:tcMar>
-          </w:tcPr>
-          <w:p>
-            <w:r>
-              <w:rPr>
-                <w:sz w:val="19"/>
-                <w:szCs w:val="19"/>
-              </w:rPr>
-              <w:t xml:space="preserve">GPIO 4</w:t>
-            </w:r>
-          </w:p>
-        </w:tc>
-        <w:tc>
-          <w:tcPr>
-            <w:tcW w:type="dxa" w:w="3000"/>
-            <w:tcBorders>
-              <w:top w:val="single" w:color="BBBBBB" w:sz="1"/>
-              <w:left w:val="single" w:color="BBBBBB" w:sz="1"/>
-              <w:bottom w:val="single" w:color="BBBBBB" w:sz="1"/>
-              <w:right w:val="single" w:color="BBBBBB" w:sz="1"/>
-            </w:tcBorders>
-            <w:shd w:fill="FFFFFF" w:val="clear"/>
-            <w:tcMar>
-              <w:top w:type="dxa" w:w="60"/>
-              <w:left w:type="dxa" w:w="120"/>
-              <w:bottom w:type="dxa" w:w="60"/>
-              <w:right w:type="dxa" w:w="120"/>
-            </w:tcMar>
-          </w:tcPr>
-          <w:p>
-            <w:r>
-              <w:rPr>
-                <w:sz w:val="19"/>
-                <w:szCs w:val="19"/>
-              </w:rPr>
-              <w:t xml:space="preserve">Numerique (OneWire)</w:t>
-            </w:r>
-          </w:p>
-        </w:tc>
-      </w:tr>
-      <w:tr>
-        <w:tc>
-          <w:tcPr>
-            <w:tcW w:type="dxa" w:w="3200"/>
-            <w:tcBorders>
-              <w:top w:val="single" w:color="BBBBBB" w:sz="1"/>
-              <w:left w:val="single" w:color="BBBBBB" w:sz="1"/>
-              <w:bottom w:val="single" w:color="BBBBBB" w:sz="1"/>
-              <w:right w:val="single" w:color="BBBBBB" w:sz="1"/>
-            </w:tcBorders>
-            <w:shd w:fill="EEF3F8" w:val="clear"/>
-            <w:tcMar>
-              <w:top w:type="dxa" w:w="60"/>
-              <w:left w:type="dxa" w:w="120"/>
-              <w:bottom w:type="dxa" w:w="60"/>
-              <w:right w:type="dxa" w:w="120"/>
-            </w:tcMar>
-          </w:tcPr>
-          <w:p>
-            <w:r>
-              <w:rPr>
-                <w:sz w:val="19"/>
-                <w:szCs w:val="19"/>
-              </w:rPr>
-              <w:t xml:space="preserve">Potentiometre (CO2)</w:t>
-            </w:r>
-          </w:p>
-        </w:tc>
-        <w:tc>
-          <w:tcPr>
-            <w:tcW w:type="dxa" w:w="3160"/>
-            <w:tcBorders>
-              <w:top w:val="single" w:color="BBBBBB" w:sz="1"/>
-              <w:left w:val="single" w:color="BBBBBB" w:sz="1"/>
-              <w:bottom w:val="single" w:color="BBBBBB" w:sz="1"/>
-              <w:right w:val="single" w:color="BBBBBB" w:sz="1"/>
-            </w:tcBorders>
-            <w:shd w:fill="EEF3F8" w:val="clear"/>
-            <w:tcMar>
-              <w:top w:type="dxa" w:w="60"/>
-              <w:left w:type="dxa" w:w="120"/>
-              <w:bottom w:type="dxa" w:w="60"/>
-              <w:right w:type="dxa" w:w="120"/>
-            </w:tcMar>
-          </w:tcPr>
-          <w:p>
-            <w:r>
-              <w:rPr>
-                <w:sz w:val="19"/>
-                <w:szCs w:val="19"/>
-              </w:rPr>
-              <w:t xml:space="preserve">GPIO 34</w:t>
-            </w:r>
-          </w:p>
-        </w:tc>
-        <w:tc>
-          <w:tcPr>
-            <w:tcW w:type="dxa" w:w="3000"/>
-            <w:tcBorders>
-              <w:top w:val="single" w:color="BBBBBB" w:sz="1"/>
-              <w:left w:val="single" w:color="BBBBBB" w:sz="1"/>
-              <w:bottom w:val="single" w:color="BBBBBB" w:sz="1"/>
-              <w:right w:val="single" w:color="BBBBBB" w:sz="1"/>
-            </w:tcBorders>
-            <w:shd w:fill="EEF3F8" w:val="clear"/>
-            <w:tcMar>
-              <w:top w:type="dxa" w:w="60"/>
-              <w:left w:type="dxa" w:w="120"/>
-              <w:bottom w:type="dxa" w:w="60"/>
-              <w:right w:type="dxa" w:w="120"/>
-            </w:tcMar>
-          </w:tcPr>
-          <w:p>
-            <w:r>
-              <w:rPr>
-                <w:sz w:val="19"/>
-                <w:szCs w:val="19"/>
-              </w:rPr>
-              <w:t xml:space="preserve">Analogique (ADC)</w:t>
-            </w:r>
-          </w:p>
-        </w:tc>
-      </w:tr>
-      <w:tr>
-        <w:tc>
-          <w:tcPr>
-            <w:tcW w:type="dxa" w:w="3200"/>
-            <w:tcBorders>
-              <w:top w:val="single" w:color="BBBBBB" w:sz="1"/>
-              <w:left w:val="single" w:color="BBBBBB" w:sz="1"/>
-              <w:bottom w:val="single" w:color="BBBBBB" w:sz="1"/>
-              <w:right w:val="single" w:color="BBBBBB" w:sz="1"/>
-            </w:tcBorders>
-            <w:shd w:fill="FFFFFF" w:val="clear"/>
-            <w:tcMar>
-              <w:top w:type="dxa" w:w="60"/>
-              <w:left w:type="dxa" w:w="120"/>
-              <w:bottom w:type="dxa" w:w="60"/>
-              <w:right w:type="dxa" w:w="120"/>
-            </w:tcMar>
-          </w:tcPr>
-          <w:p>
-            <w:r>
-              <w:rPr>
-                <w:sz w:val="19"/>
-                <w:szCs w:val="19"/>
-              </w:rPr>
-              <w:t xml:space="preserve">NTC thermistor</w:t>
-            </w:r>
-          </w:p>
-        </w:tc>
-        <w:tc>
-          <w:tcPr>
-            <w:tcW w:type="dxa" w:w="3160"/>
-            <w:tcBorders>
-              <w:top w:val="single" w:color="BBBBBB" w:sz="1"/>
-              <w:left w:val="single" w:color="BBBBBB" w:sz="1"/>
-              <w:bottom w:val="single" w:color="BBBBBB" w:sz="1"/>
-              <w:right w:val="single" w:color="BBBBBB" w:sz="1"/>
-            </w:tcBorders>
-            <w:shd w:fill="FFFFFF" w:val="clear"/>
-            <w:tcMar>
-              <w:top w:type="dxa" w:w="60"/>
-              <w:left w:type="dxa" w:w="120"/>
-              <w:bottom w:type="dxa" w:w="60"/>
-              <w:right w:type="dxa" w:w="120"/>
-            </w:tcMar>
-          </w:tcPr>
-          <w:p>
-            <w:r>
-              <w:rPr>
-                <w:sz w:val="19"/>
-                <w:szCs w:val="19"/>
-              </w:rPr>
-              <w:t xml:space="preserve">GPIO 35</w:t>
-            </w:r>
-          </w:p>
-        </w:tc>
-        <w:tc>
-          <w:tcPr>
-            <w:tcW w:type="dxa" w:w="3000"/>
-            <w:tcBorders>
-              <w:top w:val="single" w:color="BBBBBB" w:sz="1"/>
-              <w:left w:val="single" w:color="BBBBBB" w:sz="1"/>
-              <w:bottom w:val="single" w:color="BBBBBB" w:sz="1"/>
-              <w:right w:val="single" w:color="BBBBBB" w:sz="1"/>
-            </w:tcBorders>
-            <w:shd w:fill="FFFFFF" w:val="clear"/>
-            <w:tcMar>
-              <w:top w:type="dxa" w:w="60"/>
-              <w:left w:type="dxa" w:w="120"/>
-              <w:bottom w:type="dxa" w:w="60"/>
-              <w:right w:type="dxa" w:w="120"/>
-            </w:tcMar>
-          </w:tcPr>
-          <w:p>
-            <w:r>
-              <w:rPr>
-                <w:sz w:val="19"/>
-                <w:szCs w:val="19"/>
-              </w:rPr>
-              <w:t xml:space="preserve">Analogique (ADC)</w:t>
-            </w:r>
-          </w:p>
-        </w:tc>
-      </w:tr>
-      <w:tr>
-        <w:tc>
-          <w:tcPr>
-            <w:tcW w:type="dxa" w:w="3200"/>
-            <w:tcBorders>
-              <w:top w:val="single" w:color="BBBBBB" w:sz="1"/>
-              <w:left w:val="single" w:color="BBBBBB" w:sz="1"/>
-              <w:bottom w:val="single" w:color="BBBBBB" w:sz="1"/>
-              <w:right w:val="single" w:color="BBBBBB" w:sz="1"/>
-            </w:tcBorders>
-            <w:shd w:fill="EEF3F8" w:val="clear"/>
-            <w:tcMar>
-              <w:top w:type="dxa" w:w="60"/>
-              <w:left w:type="dxa" w:w="120"/>
-              <w:bottom w:type="dxa" w:w="60"/>
-              <w:right w:type="dxa" w:w="120"/>
-            </w:tcMar>
-          </w:tcPr>
-          <w:p>
-            <w:r>
-              <w:rPr>
-                <w:sz w:val="19"/>
-                <w:szCs w:val="19"/>
-              </w:rPr>
-              <w:t xml:space="preserve">LED verte (sain)</w:t>
-            </w:r>
-          </w:p>
-        </w:tc>
-        <w:tc>
-          <w:tcPr>
-            <w:tcW w:type="dxa" w:w="3160"/>
-            <w:tcBorders>
-              <w:top w:val="single" w:color="BBBBBB" w:sz="1"/>
-              <w:left w:val="single" w:color="BBBBBB" w:sz="1"/>
-              <w:bottom w:val="single" w:color="BBBBBB" w:sz="1"/>
-              <w:right w:val="single" w:color="BBBBBB" w:sz="1"/>
-            </w:tcBorders>
-            <w:shd w:fill="EEF3F8" w:val="clear"/>
-            <w:tcMar>
-              <w:top w:type="dxa" w:w="60"/>
-              <w:left w:type="dxa" w:w="120"/>
-              <w:bottom w:type="dxa" w:w="60"/>
-              <w:right w:type="dxa" w:w="120"/>
-            </w:tcMar>
-          </w:tcPr>
-          <w:p>
-            <w:r>
-              <w:rPr>
-                <w:sz w:val="19"/>
-                <w:szCs w:val="19"/>
-              </w:rPr>
-              <w:t xml:space="preserve">GPIO 25</w:t>
-            </w:r>
-          </w:p>
-        </w:tc>
-        <w:tc>
-          <w:tcPr>
-            <w:tcW w:type="dxa" w:w="3000"/>
-            <w:tcBorders>
-              <w:top w:val="single" w:color="BBBBBB" w:sz="1"/>
-              <w:left w:val="single" w:color="BBBBBB" w:sz="1"/>
-              <w:bottom w:val="single" w:color="BBBBBB" w:sz="1"/>
-              <w:right w:val="single" w:color="BBBBBB" w:sz="1"/>
-            </w:tcBorders>
-            <w:shd w:fill="EEF3F8" w:val="clear"/>
-            <w:tcMar>
-              <w:top w:type="dxa" w:w="60"/>
-              <w:left w:type="dxa" w:w="120"/>
-              <w:bottom w:type="dxa" w:w="60"/>
-              <w:right w:type="dxa" w:w="120"/>
-            </w:tcMar>
-          </w:tcPr>
-          <w:p>
-            <w:r>
-              <w:rPr>
-                <w:sz w:val="19"/>
-                <w:szCs w:val="19"/>
-              </w:rPr>
-              <w:t xml:space="preserve">Numerique (sortie)</w:t>
-            </w:r>
-          </w:p>
-        </w:tc>
-      </w:tr>
-      <w:tr>
-        <w:tc>
-          <w:tcPr>
-            <w:tcW w:type="dxa" w:w="3200"/>
-            <w:tcBorders>
-              <w:top w:val="single" w:color="BBBBBB" w:sz="1"/>
-              <w:left w:val="single" w:color="BBBBBB" w:sz="1"/>
-              <w:bottom w:val="single" w:color="BBBBBB" w:sz="1"/>
-              <w:right w:val="single" w:color="BBBBBB" w:sz="1"/>
-            </w:tcBorders>
-            <w:shd w:fill="FFFFFF" w:val="clear"/>
-            <w:tcMar>
-              <w:top w:type="dxa" w:w="60"/>
-              <w:left w:type="dxa" w:w="120"/>
-              <w:bottom w:type="dxa" w:w="60"/>
-              <w:right w:type="dxa" w:w="120"/>
-            </w:tcMar>
-          </w:tcPr>
-          <w:p>
-            <w:r>
-              <w:rPr>
-                <w:sz w:val="19"/>
-                <w:szCs w:val="19"/>
-              </w:rPr>
-              <w:t xml:space="preserve">LED orange (modere)</w:t>
-            </w:r>
-          </w:p>
-        </w:tc>
-        <w:tc>
-          <w:tcPr>
-            <w:tcW w:type="dxa" w:w="3160"/>
-            <w:tcBorders>
-              <w:top w:val="single" w:color="BBBBBB" w:sz="1"/>
-              <w:left w:val="single" w:color="BBBBBB" w:sz="1"/>
-              <w:bottom w:val="single" w:color="BBBBBB" w:sz="1"/>
-              <w:right w:val="single" w:color="BBBBBB" w:sz="1"/>
-            </w:tcBorders>
-            <w:shd w:fill="FFFFFF" w:val="clear"/>
-            <w:tcMar>
-              <w:top w:type="dxa" w:w="60"/>
-              <w:left w:type="dxa" w:w="120"/>
-              <w:bottom w:type="dxa" w:w="60"/>
-              <w:right w:type="dxa" w:w="120"/>
-            </w:tcMar>
-          </w:tcPr>
-          <w:p>
-            <w:r>
-              <w:rPr>
-                <w:sz w:val="19"/>
-                <w:szCs w:val="19"/>
-              </w:rPr>
-              <w:t xml:space="preserve">GPIO 26</w:t>
-            </w:r>
-          </w:p>
-        </w:tc>
-        <w:tc>
-          <w:tcPr>
-            <w:tcW w:type="dxa" w:w="3000"/>
-            <w:tcBorders>
-              <w:top w:val="single" w:color="BBBBBB" w:sz="1"/>
-              <w:left w:val="single" w:color="BBBBBB" w:sz="1"/>
-              <w:bottom w:val="single" w:color="BBBBBB" w:sz="1"/>
-              <w:right w:val="single" w:color="BBBBBB" w:sz="1"/>
-            </w:tcBorders>
-            <w:shd w:fill="FFFFFF" w:val="clear"/>
-            <w:tcMar>
-              <w:top w:type="dxa" w:w="60"/>
-              <w:left w:type="dxa" w:w="120"/>
-              <w:bottom w:type="dxa" w:w="60"/>
-              <w:right w:type="dxa" w:w="120"/>
-            </w:tcMar>
-          </w:tcPr>
-          <w:p>
-            <w:r>
-              <w:rPr>
-                <w:sz w:val="19"/>
-                <w:szCs w:val="19"/>
-              </w:rPr>
-              <w:t xml:space="preserve">Numerique (sortie)</w:t>
-            </w:r>
-          </w:p>
-        </w:tc>
-      </w:tr>
-      <w:tr>
-        <w:tc>
-          <w:tcPr>
-            <w:tcW w:type="dxa" w:w="3200"/>
-            <w:tcBorders>
-              <w:top w:val="single" w:color="BBBBBB" w:sz="1"/>
-              <w:left w:val="single" w:color="BBBBBB" w:sz="1"/>
-              <w:bottom w:val="single" w:color="BBBBBB" w:sz="1"/>
-              <w:right w:val="single" w:color="BBBBBB" w:sz="1"/>
-            </w:tcBorders>
-            <w:shd w:fill="EEF3F8" w:val="clear"/>
-            <w:tcMar>
-              <w:top w:type="dxa" w:w="60"/>
-              <w:left w:type="dxa" w:w="120"/>
-              <w:bottom w:type="dxa" w:w="60"/>
-              <w:right w:type="dxa" w:w="120"/>
-            </w:tcMar>
-          </w:tcPr>
-          <w:p>
-            <w:r>
-              <w:rPr>
-                <w:sz w:val="19"/>
-                <w:szCs w:val="19"/>
-              </w:rPr>
-              <w:t xml:space="preserve">LED rouge (pollue)</w:t>
-            </w:r>
-          </w:p>
-        </w:tc>
-        <w:tc>
-          <w:tcPr>
-            <w:tcW w:type="dxa" w:w="3160"/>
-            <w:tcBorders>
-              <w:top w:val="single" w:color="BBBBBB" w:sz="1"/>
-              <w:left w:val="single" w:color="BBBBBB" w:sz="1"/>
-              <w:bottom w:val="single" w:color="BBBBBB" w:sz="1"/>
-              <w:right w:val="single" w:color="BBBBBB" w:sz="1"/>
-            </w:tcBorders>
-            <w:shd w:fill="EEF3F8" w:val="clear"/>
-            <w:tcMar>
-              <w:top w:type="dxa" w:w="60"/>
-              <w:left w:type="dxa" w:w="120"/>
-              <w:bottom w:type="dxa" w:w="60"/>
-              <w:right w:type="dxa" w:w="120"/>
-            </w:tcMar>
-          </w:tcPr>
-          <w:p>
-            <w:r>
-              <w:rPr>
-                <w:sz w:val="19"/>
-                <w:szCs w:val="19"/>
-              </w:rPr>
-              <w:t xml:space="preserve">GPIO 27</w:t>
-            </w:r>
-          </w:p>
-        </w:tc>
-        <w:tc>
-          <w:tcPr>
-            <w:tcW w:type="dxa" w:w="3000"/>
-            <w:tcBorders>
-              <w:top w:val="single" w:color="BBBBBB" w:sz="1"/>
-              <w:left w:val="single" w:color="BBBBBB" w:sz="1"/>
-              <w:bottom w:val="single" w:color="BBBBBB" w:sz="1"/>
-              <w:right w:val="single" w:color="BBBBBB" w:sz="1"/>
-            </w:tcBorders>
-            <w:shd w:fill="EEF3F8" w:val="clear"/>
-            <w:tcMar>
-              <w:top w:type="dxa" w:w="60"/>
-              <w:left w:type="dxa" w:w="120"/>
-              <w:bottom w:type="dxa" w:w="60"/>
-              <w:right w:type="dxa" w:w="120"/>
-            </w:tcMar>
-          </w:tcPr>
-          <w:p>
-            <w:r>
-              <w:rPr>
-                <w:sz w:val="19"/>
-                <w:szCs w:val="19"/>
-              </w:rPr>
-              <w:t xml:space="preserve">Numerique (sortie)</w:t>
-            </w:r>
-          </w:p>
-        </w:tc>
-      </w:tr>
-      <w:tr>
-        <w:tc>
-          <w:tcPr>
-            <w:tcW w:type="dxa" w:w="3200"/>
-            <w:tcBorders>
-              <w:top w:val="single" w:color="BBBBBB" w:sz="1"/>
-              <w:left w:val="single" w:color="BBBBBB" w:sz="1"/>
-              <w:bottom w:val="single" w:color="BBBBBB" w:sz="1"/>
-              <w:right w:val="single" w:color="BBBBBB" w:sz="1"/>
-            </w:tcBorders>
-            <w:shd w:fill="FFFFFF" w:val="clear"/>
-            <w:tcMar>
-              <w:top w:type="dxa" w:w="60"/>
-              <w:left w:type="dxa" w:w="120"/>
-              <w:bottom w:type="dxa" w:w="60"/>
-              <w:right w:type="dxa" w:w="120"/>
-            </w:tcMar>
-          </w:tcPr>
-          <w:p>
-            <w:r>
-              <w:rPr>
-                <w:sz w:val="19"/>
-                <w:szCs w:val="19"/>
-              </w:rPr>
-              <w:t xml:space="preserve">Buzzer</w:t>
-            </w:r>
-          </w:p>
-        </w:tc>
-        <w:tc>
-          <w:tcPr>
-            <w:tcW w:type="dxa" w:w="3160"/>
-            <w:tcBorders>
-              <w:top w:val="single" w:color="BBBBBB" w:sz="1"/>
-              <w:left w:val="single" w:color="BBBBBB" w:sz="1"/>
-              <w:bottom w:val="single" w:color="BBBBBB" w:sz="1"/>
-              <w:right w:val="single" w:color="BBBBBB" w:sz="1"/>
-            </w:tcBorders>
-            <w:shd w:fill="FFFFFF" w:val="clear"/>
-            <w:tcMar>
-              <w:top w:type="dxa" w:w="60"/>
-              <w:left w:type="dxa" w:w="120"/>
-              <w:bottom w:type="dxa" w:w="60"/>
-              <w:right w:type="dxa" w:w="120"/>
-            </w:tcMar>
-          </w:tcPr>
-          <w:p>
-            <w:r>
-              <w:rPr>
-                <w:sz w:val="19"/>
-                <w:szCs w:val="19"/>
-              </w:rPr>
-              <w:t xml:space="preserve">GPIO 14</w:t>
-            </w:r>
-          </w:p>
-        </w:tc>
-        <w:tc>
-          <w:tcPr>
-            <w:tcW w:type="dxa" w:w="3000"/>
-            <w:tcBorders>
-              <w:top w:val="single" w:color="BBBBBB" w:sz="1"/>
-              <w:left w:val="single" w:color="BBBBBB" w:sz="1"/>
-              <w:bottom w:val="single" w:color="BBBBBB" w:sz="1"/>
-              <w:right w:val="single" w:color="BBBBBB" w:sz="1"/>
-            </w:tcBorders>
-            <w:shd w:fill="FFFFFF" w:val="clear"/>
-            <w:tcMar>
-              <w:top w:type="dxa" w:w="60"/>
-              <w:left w:type="dxa" w:w="120"/>
-              <w:bottom w:type="dxa" w:w="60"/>
-              <w:right w:type="dxa" w:w="120"/>
-            </w:tcMar>
-          </w:tcPr>
-          <w:p>
-            <w:r>
-              <w:rPr>
-                <w:sz w:val="19"/>
-                <w:szCs w:val="19"/>
-              </w:rPr>
-              <w:t xml:space="preserve">Numerique (sortie)</w:t>
-            </w:r>
-          </w:p>
-        </w:tc>
-      </w:tr>
-      <w:tr>
-        <w:tc>
-          <w:tcPr>
-            <w:tcW w:type="dxa" w:w="3200"/>
-            <w:tcBorders>
-              <w:top w:val="single" w:color="BBBBBB" w:sz="1"/>
-              <w:left w:val="single" w:color="BBBBBB" w:sz="1"/>
-              <w:bottom w:val="single" w:color="BBBBBB" w:sz="1"/>
-              <w:right w:val="single" w:color="BBBBBB" w:sz="1"/>
-            </w:tcBorders>
-            <w:shd w:fill="EEF3F8" w:val="clear"/>
-            <w:tcMar>
-              <w:top w:type="dxa" w:w="60"/>
-              <w:left w:type="dxa" w:w="120"/>
-              <w:bottom w:type="dxa" w:w="60"/>
-              <w:right w:type="dxa" w:w="120"/>
-            </w:tcMar>
-          </w:tcPr>
-          <w:p>
-            <w:r>
-              <w:rPr>
-                <w:sz w:val="19"/>
-                <w:szCs w:val="19"/>
-              </w:rPr>
-              <w:t xml:space="preserve">OLED SDA / SCL</w:t>
-            </w:r>
-          </w:p>
-        </w:tc>
-        <w:tc>
-          <w:tcPr>
-            <w:tcW w:type="dxa" w:w="3160"/>
-            <w:tcBorders>
-              <w:top w:val="single" w:color="BBBBBB" w:sz="1"/>
-              <w:left w:val="single" w:color="BBBBBB" w:sz="1"/>
-              <w:bottom w:val="single" w:color="BBBBBB" w:sz="1"/>
-              <w:right w:val="single" w:color="BBBBBB" w:sz="1"/>
-            </w:tcBorders>
-            <w:shd w:fill="EEF3F8" w:val="clear"/>
-            <w:tcMar>
-              <w:top w:type="dxa" w:w="60"/>
-              <w:left w:type="dxa" w:w="120"/>
-              <w:bottom w:type="dxa" w:w="60"/>
-              <w:right w:type="dxa" w:w="120"/>
-            </w:tcMar>
-          </w:tcPr>
-          <w:p>
-            <w:r>
-              <w:rPr>
-                <w:sz w:val="19"/>
-                <w:szCs w:val="19"/>
-              </w:rPr>
-              <w:t xml:space="preserve">GPIO 21 / GPIO 22</w:t>
-            </w:r>
-          </w:p>
-        </w:tc>
-        <w:tc>
-          <w:tcPr>
-            <w:tcW w:type="dxa" w:w="3000"/>
-            <w:tcBorders>
-              <w:top w:val="single" w:color="BBBBBB" w:sz="1"/>
-              <w:left w:val="single" w:color="BBBBBB" w:sz="1"/>
-              <w:bottom w:val="single" w:color="BBBBBB" w:sz="1"/>
-              <w:right w:val="single" w:color="BBBBBB" w:sz="1"/>
-            </w:tcBorders>
-            <w:shd w:fill="EEF3F8" w:val="clear"/>
-            <w:tcMar>
-              <w:top w:type="dxa" w:w="60"/>
-              <w:left w:type="dxa" w:w="120"/>
-              <w:bottom w:type="dxa" w:w="60"/>
-              <w:right w:type="dxa" w:w="120"/>
-            </w:tcMar>
-          </w:tcPr>
-          <w:p>
-            <w:r>
-              <w:rPr>
-                <w:sz w:val="19"/>
-                <w:szCs w:val="19"/>
-              </w:rPr>
-              <w:t xml:space="preserve">Bus I2C</w:t>
-            </w:r>
-          </w:p>
-        </w:tc>
-      </w:tr>
-    </w:tbl>
-    <w:p>
-      <w:r>
-        <w:t xml:space="preserve"/>
-      </w:r>
-    </w:p>
     <w:p>
       <w:pPr>
         <w:spacing w:after="60"/>
@@ -2878,9 +1213,9 @@
       <w:r>
         <w:drawing>
           <wp:inline distT="0" distB="0" distL="0" distR="0">
-            <wp:extent cx="5715000" cy="4905375"/>
+            <wp:extent cx="5715000" cy="3400425"/>
             <wp:effectExtent t="0" r="0" b="0" l="0"/>
-            <wp:docPr id="1" name="fig2_cablage.png" descr="Figure 2 : Schema de cablage complet sur Wokwi (diagram.json)" title="Figure 2 : Schema de cablage complet sur Wokwi (diagram.json)"/>
+            <wp:docPr id="1" name="fig1_schema.png" descr="Figure 1 : Schema fonctionnel (entrees / traitement / sorties / Blynk)" title="Figure 1 : Schema fonctionnel (entrees / traitement / sorties / Blynk)"/>
             <wp:cNvGraphicFramePr>
               <a:graphicFrameLocks xmlns:a="http://schemas.openxmlformats.org/drawingml/2006/main" noChangeAspect="1"/>
             </wp:cNvGraphicFramePr>
@@ -2903,6 +1238,1650 @@
                   <pic:spPr bwMode="auto">
                     <a:xfrm>
                       <a:off x="0" y="0"/>
+                      <a:ext cx="5715000" cy="3400425"/>
+                    </a:xfrm>
+                    <a:prstGeom prst="rect">
+                      <a:avLst/>
+                    </a:prstGeom>
+                  </pic:spPr>
+                </pic:pic>
+              </a:graphicData>
+            </a:graphic>
+          </wp:inline>
+        </w:drawing>
+      </w:r>
+    </w:p>
+    <w:p>
+      <w:r>
+        <w:br w:type="page"/>
+      </w:r>
+    </w:p>
+    <w:p>
+      <w:pPr>
+        <w:pStyle w:val="Heading1"/>
+      </w:pPr>
+      <w:r>
+        <w:t xml:space="preserve">3. Liste des composants (BOM) et justification</w:t>
+      </w:r>
+    </w:p>
+    <w:tbl>
+      <w:tblPr>
+        <w:tblW w:type="dxa" w:w="9360"/>
+        <w:tblBorders>
+          <w:top w:val="single" w:color="auto" w:sz="4"/>
+          <w:left w:val="single" w:color="auto" w:sz="4"/>
+          <w:bottom w:val="single" w:color="auto" w:sz="4"/>
+          <w:right w:val="single" w:color="auto" w:sz="4"/>
+          <w:insideH w:val="single" w:color="auto" w:sz="4"/>
+          <w:insideV w:val="single" w:color="auto" w:sz="4"/>
+        </w:tblBorders>
+      </w:tblPr>
+      <w:tblGrid>
+        <w:gridCol w:w="2300"/>
+        <w:gridCol w:w="3000"/>
+        <w:gridCol w:w="4060"/>
+      </w:tblGrid>
+      <w:tr>
+        <w:trPr>
+          <w:tblHeader/>
+        </w:trPr>
+        <w:tc>
+          <w:tcPr>
+            <w:tcW w:type="dxa" w:w="2300"/>
+            <w:tcBorders>
+              <w:top w:val="single" w:color="BBBBBB" w:sz="1"/>
+              <w:left w:val="single" w:color="BBBBBB" w:sz="1"/>
+              <w:bottom w:val="single" w:color="BBBBBB" w:sz="1"/>
+              <w:right w:val="single" w:color="BBBBBB" w:sz="1"/>
+            </w:tcBorders>
+            <w:shd w:fill="2E5C8A" w:val="clear"/>
+            <w:tcMar>
+              <w:top w:type="dxa" w:w="80"/>
+              <w:left w:type="dxa" w:w="120"/>
+              <w:bottom w:type="dxa" w:w="80"/>
+              <w:right w:type="dxa" w:w="120"/>
+            </w:tcMar>
+          </w:tcPr>
+          <w:p>
+            <w:r>
+              <w:rPr>
+                <w:b/>
+                <w:bCs/>
+                <w:color w:val="FFFFFF"/>
+                <w:sz w:val="20"/>
+                <w:szCs w:val="20"/>
+              </w:rPr>
+              <w:t xml:space="preserve">Composant</w:t>
+            </w:r>
+          </w:p>
+        </w:tc>
+        <w:tc>
+          <w:tcPr>
+            <w:tcW w:type="dxa" w:w="3000"/>
+            <w:tcBorders>
+              <w:top w:val="single" w:color="BBBBBB" w:sz="1"/>
+              <w:left w:val="single" w:color="BBBBBB" w:sz="1"/>
+              <w:bottom w:val="single" w:color="BBBBBB" w:sz="1"/>
+              <w:right w:val="single" w:color="BBBBBB" w:sz="1"/>
+            </w:tcBorders>
+            <w:shd w:fill="2E5C8A" w:val="clear"/>
+            <w:tcMar>
+              <w:top w:type="dxa" w:w="80"/>
+              <w:left w:type="dxa" w:w="120"/>
+              <w:bottom w:type="dxa" w:w="80"/>
+              <w:right w:type="dxa" w:w="120"/>
+            </w:tcMar>
+          </w:tcPr>
+          <w:p>
+            <w:r>
+              <w:rPr>
+                <w:b/>
+                <w:bCs/>
+                <w:color w:val="FFFFFF"/>
+                <w:sz w:val="20"/>
+                <w:szCs w:val="20"/>
+              </w:rPr>
+              <w:t xml:space="preserve">Role dans le projet</w:t>
+            </w:r>
+          </w:p>
+        </w:tc>
+        <w:tc>
+          <w:tcPr>
+            <w:tcW w:type="dxa" w:w="4060"/>
+            <w:tcBorders>
+              <w:top w:val="single" w:color="BBBBBB" w:sz="1"/>
+              <w:left w:val="single" w:color="BBBBBB" w:sz="1"/>
+              <w:bottom w:val="single" w:color="BBBBBB" w:sz="1"/>
+              <w:right w:val="single" w:color="BBBBBB" w:sz="1"/>
+            </w:tcBorders>
+            <w:shd w:fill="2E5C8A" w:val="clear"/>
+            <w:tcMar>
+              <w:top w:type="dxa" w:w="80"/>
+              <w:left w:type="dxa" w:w="120"/>
+              <w:bottom w:type="dxa" w:w="80"/>
+              <w:right w:type="dxa" w:w="120"/>
+            </w:tcMar>
+          </w:tcPr>
+          <w:p>
+            <w:r>
+              <w:rPr>
+                <w:b/>
+                <w:bCs/>
+                <w:color w:val="FFFFFF"/>
+                <w:sz w:val="20"/>
+                <w:szCs w:val="20"/>
+              </w:rPr>
+              <w:t xml:space="preserve">Justification du choix</w:t>
+            </w:r>
+          </w:p>
+        </w:tc>
+      </w:tr>
+      <w:tr>
+        <w:tc>
+          <w:tcPr>
+            <w:tcW w:type="dxa" w:w="2300"/>
+            <w:tcBorders>
+              <w:top w:val="single" w:color="BBBBBB" w:sz="1"/>
+              <w:left w:val="single" w:color="BBBBBB" w:sz="1"/>
+              <w:bottom w:val="single" w:color="BBBBBB" w:sz="1"/>
+              <w:right w:val="single" w:color="BBBBBB" w:sz="1"/>
+            </w:tcBorders>
+            <w:shd w:fill="FFFFFF" w:val="clear"/>
+            <w:tcMar>
+              <w:top w:type="dxa" w:w="60"/>
+              <w:left w:type="dxa" w:w="120"/>
+              <w:bottom w:type="dxa" w:w="60"/>
+              <w:right w:type="dxa" w:w="120"/>
+            </w:tcMar>
+          </w:tcPr>
+          <w:p>
+            <w:r>
+              <w:rPr>
+                <w:sz w:val="19"/>
+                <w:szCs w:val="19"/>
+              </w:rPr>
+              <w:t xml:space="preserve">ESP32 DevKit C v4</w:t>
+            </w:r>
+          </w:p>
+        </w:tc>
+        <w:tc>
+          <w:tcPr>
+            <w:tcW w:type="dxa" w:w="3000"/>
+            <w:tcBorders>
+              <w:top w:val="single" w:color="BBBBBB" w:sz="1"/>
+              <w:left w:val="single" w:color="BBBBBB" w:sz="1"/>
+              <w:bottom w:val="single" w:color="BBBBBB" w:sz="1"/>
+              <w:right w:val="single" w:color="BBBBBB" w:sz="1"/>
+            </w:tcBorders>
+            <w:shd w:fill="FFFFFF" w:val="clear"/>
+            <w:tcMar>
+              <w:top w:type="dxa" w:w="60"/>
+              <w:left w:type="dxa" w:w="120"/>
+              <w:bottom w:type="dxa" w:w="60"/>
+              <w:right w:type="dxa" w:w="120"/>
+            </w:tcMar>
+          </w:tcPr>
+          <w:p>
+            <w:r>
+              <w:rPr>
+                <w:sz w:val="19"/>
+                <w:szCs w:val="19"/>
+              </w:rPr>
+              <w:t xml:space="preserve">Unite de traitement + Wi-Fi</w:t>
+            </w:r>
+          </w:p>
+        </w:tc>
+        <w:tc>
+          <w:tcPr>
+            <w:tcW w:type="dxa" w:w="4060"/>
+            <w:tcBorders>
+              <w:top w:val="single" w:color="BBBBBB" w:sz="1"/>
+              <w:left w:val="single" w:color="BBBBBB" w:sz="1"/>
+              <w:bottom w:val="single" w:color="BBBBBB" w:sz="1"/>
+              <w:right w:val="single" w:color="BBBBBB" w:sz="1"/>
+            </w:tcBorders>
+            <w:shd w:fill="FFFFFF" w:val="clear"/>
+            <w:tcMar>
+              <w:top w:type="dxa" w:w="60"/>
+              <w:left w:type="dxa" w:w="120"/>
+              <w:bottom w:type="dxa" w:w="60"/>
+              <w:right w:type="dxa" w:w="120"/>
+            </w:tcMar>
+          </w:tcPr>
+          <w:p>
+            <w:r>
+              <w:rPr>
+                <w:sz w:val="19"/>
+                <w:szCs w:val="19"/>
+              </w:rPr>
+              <w:t xml:space="preserve">Microcontroleur impose, Wi-Fi integre pour Blynk</w:t>
+            </w:r>
+          </w:p>
+        </w:tc>
+      </w:tr>
+      <w:tr>
+        <w:tc>
+          <w:tcPr>
+            <w:tcW w:type="dxa" w:w="2300"/>
+            <w:tcBorders>
+              <w:top w:val="single" w:color="BBBBBB" w:sz="1"/>
+              <w:left w:val="single" w:color="BBBBBB" w:sz="1"/>
+              <w:bottom w:val="single" w:color="BBBBBB" w:sz="1"/>
+              <w:right w:val="single" w:color="BBBBBB" w:sz="1"/>
+            </w:tcBorders>
+            <w:shd w:fill="EEF3F8" w:val="clear"/>
+            <w:tcMar>
+              <w:top w:type="dxa" w:w="60"/>
+              <w:left w:type="dxa" w:w="120"/>
+              <w:bottom w:type="dxa" w:w="60"/>
+              <w:right w:type="dxa" w:w="120"/>
+            </w:tcMar>
+          </w:tcPr>
+          <w:p>
+            <w:r>
+              <w:rPr>
+                <w:sz w:val="19"/>
+                <w:szCs w:val="19"/>
+              </w:rPr>
+              <w:t xml:space="preserve">DHT22</w:t>
+            </w:r>
+          </w:p>
+        </w:tc>
+        <w:tc>
+          <w:tcPr>
+            <w:tcW w:type="dxa" w:w="3000"/>
+            <w:tcBorders>
+              <w:top w:val="single" w:color="BBBBBB" w:sz="1"/>
+              <w:left w:val="single" w:color="BBBBBB" w:sz="1"/>
+              <w:bottom w:val="single" w:color="BBBBBB" w:sz="1"/>
+              <w:right w:val="single" w:color="BBBBBB" w:sz="1"/>
+            </w:tcBorders>
+            <w:shd w:fill="EEF3F8" w:val="clear"/>
+            <w:tcMar>
+              <w:top w:type="dxa" w:w="60"/>
+              <w:left w:type="dxa" w:w="120"/>
+              <w:bottom w:type="dxa" w:w="60"/>
+              <w:right w:type="dxa" w:w="120"/>
+            </w:tcMar>
+          </w:tcPr>
+          <w:p>
+            <w:r>
+              <w:rPr>
+                <w:sz w:val="19"/>
+                <w:szCs w:val="19"/>
+              </w:rPr>
+              <w:t xml:space="preserve">Temperature + humidite</w:t>
+            </w:r>
+          </w:p>
+        </w:tc>
+        <w:tc>
+          <w:tcPr>
+            <w:tcW w:type="dxa" w:w="4060"/>
+            <w:tcBorders>
+              <w:top w:val="single" w:color="BBBBBB" w:sz="1"/>
+              <w:left w:val="single" w:color="BBBBBB" w:sz="1"/>
+              <w:bottom w:val="single" w:color="BBBBBB" w:sz="1"/>
+              <w:right w:val="single" w:color="BBBBBB" w:sz="1"/>
+            </w:tcBorders>
+            <w:shd w:fill="EEF3F8" w:val="clear"/>
+            <w:tcMar>
+              <w:top w:type="dxa" w:w="60"/>
+              <w:left w:type="dxa" w:w="120"/>
+              <w:bottom w:type="dxa" w:w="60"/>
+              <w:right w:type="dxa" w:w="120"/>
+            </w:tcMar>
+          </w:tcPr>
+          <w:p>
+            <w:r>
+              <w:rPr>
+                <w:sz w:val="19"/>
+                <w:szCs w:val="19"/>
+              </w:rPr>
+              <w:t xml:space="preserve">Capteur natif Wokwi, mesure les 2 grandeurs cles</w:t>
+            </w:r>
+          </w:p>
+        </w:tc>
+      </w:tr>
+      <w:tr>
+        <w:tc>
+          <w:tcPr>
+            <w:tcW w:type="dxa" w:w="2300"/>
+            <w:tcBorders>
+              <w:top w:val="single" w:color="BBBBBB" w:sz="1"/>
+              <w:left w:val="single" w:color="BBBBBB" w:sz="1"/>
+              <w:bottom w:val="single" w:color="BBBBBB" w:sz="1"/>
+              <w:right w:val="single" w:color="BBBBBB" w:sz="1"/>
+            </w:tcBorders>
+            <w:shd w:fill="FFFFFF" w:val="clear"/>
+            <w:tcMar>
+              <w:top w:type="dxa" w:w="60"/>
+              <w:left w:type="dxa" w:w="120"/>
+              <w:bottom w:type="dxa" w:w="60"/>
+              <w:right w:type="dxa" w:w="120"/>
+            </w:tcMar>
+          </w:tcPr>
+          <w:p>
+            <w:r>
+              <w:rPr>
+                <w:sz w:val="19"/>
+                <w:szCs w:val="19"/>
+              </w:rPr>
+              <w:t xml:space="preserve">Potentiometre</w:t>
+            </w:r>
+          </w:p>
+        </w:tc>
+        <w:tc>
+          <w:tcPr>
+            <w:tcW w:type="dxa" w:w="3000"/>
+            <w:tcBorders>
+              <w:top w:val="single" w:color="BBBBBB" w:sz="1"/>
+              <w:left w:val="single" w:color="BBBBBB" w:sz="1"/>
+              <w:bottom w:val="single" w:color="BBBBBB" w:sz="1"/>
+              <w:right w:val="single" w:color="BBBBBB" w:sz="1"/>
+            </w:tcBorders>
+            <w:shd w:fill="FFFFFF" w:val="clear"/>
+            <w:tcMar>
+              <w:top w:type="dxa" w:w="60"/>
+              <w:left w:type="dxa" w:w="120"/>
+              <w:bottom w:type="dxa" w:w="60"/>
+              <w:right w:type="dxa" w:w="120"/>
+            </w:tcMar>
+          </w:tcPr>
+          <w:p>
+            <w:r>
+              <w:rPr>
+                <w:sz w:val="19"/>
+                <w:szCs w:val="19"/>
+              </w:rPr>
+              <w:t xml:space="preserve">Indice CO2/COV simule</w:t>
+            </w:r>
+          </w:p>
+        </w:tc>
+        <w:tc>
+          <w:tcPr>
+            <w:tcW w:type="dxa" w:w="4060"/>
+            <w:tcBorders>
+              <w:top w:val="single" w:color="BBBBBB" w:sz="1"/>
+              <w:left w:val="single" w:color="BBBBBB" w:sz="1"/>
+              <w:bottom w:val="single" w:color="BBBBBB" w:sz="1"/>
+              <w:right w:val="single" w:color="BBBBBB" w:sz="1"/>
+            </w:tcBorders>
+            <w:shd w:fill="FFFFFF" w:val="clear"/>
+            <w:tcMar>
+              <w:top w:type="dxa" w:w="60"/>
+              <w:left w:type="dxa" w:w="120"/>
+              <w:bottom w:type="dxa" w:w="60"/>
+              <w:right w:type="dxa" w:w="120"/>
+            </w:tcMar>
+          </w:tcPr>
+          <w:p>
+            <w:r>
+              <w:rPr>
+                <w:sz w:val="19"/>
+                <w:szCs w:val="19"/>
+              </w:rPr>
+              <w:t xml:space="preserve">Simule un capteur analogique absent de Wokwi</w:t>
+            </w:r>
+          </w:p>
+        </w:tc>
+      </w:tr>
+      <w:tr>
+        <w:tc>
+          <w:tcPr>
+            <w:tcW w:type="dxa" w:w="2300"/>
+            <w:tcBorders>
+              <w:top w:val="single" w:color="BBBBBB" w:sz="1"/>
+              <w:left w:val="single" w:color="BBBBBB" w:sz="1"/>
+              <w:bottom w:val="single" w:color="BBBBBB" w:sz="1"/>
+              <w:right w:val="single" w:color="BBBBBB" w:sz="1"/>
+            </w:tcBorders>
+            <w:shd w:fill="EEF3F8" w:val="clear"/>
+            <w:tcMar>
+              <w:top w:type="dxa" w:w="60"/>
+              <w:left w:type="dxa" w:w="120"/>
+              <w:bottom w:type="dxa" w:w="60"/>
+              <w:right w:type="dxa" w:w="120"/>
+            </w:tcMar>
+          </w:tcPr>
+          <w:p>
+            <w:r>
+              <w:rPr>
+                <w:sz w:val="19"/>
+                <w:szCs w:val="19"/>
+              </w:rPr>
+              <w:t xml:space="preserve">NTC thermistor</w:t>
+            </w:r>
+          </w:p>
+        </w:tc>
+        <w:tc>
+          <w:tcPr>
+            <w:tcW w:type="dxa" w:w="3000"/>
+            <w:tcBorders>
+              <w:top w:val="single" w:color="BBBBBB" w:sz="1"/>
+              <w:left w:val="single" w:color="BBBBBB" w:sz="1"/>
+              <w:bottom w:val="single" w:color="BBBBBB" w:sz="1"/>
+              <w:right w:val="single" w:color="BBBBBB" w:sz="1"/>
+            </w:tcBorders>
+            <w:shd w:fill="EEF3F8" w:val="clear"/>
+            <w:tcMar>
+              <w:top w:type="dxa" w:w="60"/>
+              <w:left w:type="dxa" w:w="120"/>
+              <w:bottom w:type="dxa" w:w="60"/>
+              <w:right w:type="dxa" w:w="120"/>
+            </w:tcMar>
+          </w:tcPr>
+          <w:p>
+            <w:r>
+              <w:rPr>
+                <w:sz w:val="19"/>
+                <w:szCs w:val="19"/>
+              </w:rPr>
+              <w:t xml:space="preserve">Temperature secondaire</w:t>
+            </w:r>
+          </w:p>
+        </w:tc>
+        <w:tc>
+          <w:tcPr>
+            <w:tcW w:type="dxa" w:w="4060"/>
+            <w:tcBorders>
+              <w:top w:val="single" w:color="BBBBBB" w:sz="1"/>
+              <w:left w:val="single" w:color="BBBBBB" w:sz="1"/>
+              <w:bottom w:val="single" w:color="BBBBBB" w:sz="1"/>
+              <w:right w:val="single" w:color="BBBBBB" w:sz="1"/>
+            </w:tcBorders>
+            <w:shd w:fill="EEF3F8" w:val="clear"/>
+            <w:tcMar>
+              <w:top w:type="dxa" w:w="60"/>
+              <w:left w:type="dxa" w:w="120"/>
+              <w:bottom w:type="dxa" w:w="60"/>
+              <w:right w:type="dxa" w:w="120"/>
+            </w:tcMar>
+          </w:tcPr>
+          <w:p>
+            <w:r>
+              <w:rPr>
+                <w:sz w:val="19"/>
+                <w:szCs w:val="19"/>
+              </w:rPr>
+              <w:t xml:space="preserve">Controle croise de la temperature (redondance)</w:t>
+            </w:r>
+          </w:p>
+        </w:tc>
+      </w:tr>
+      <w:tr>
+        <w:tc>
+          <w:tcPr>
+            <w:tcW w:type="dxa" w:w="2300"/>
+            <w:tcBorders>
+              <w:top w:val="single" w:color="BBBBBB" w:sz="1"/>
+              <w:left w:val="single" w:color="BBBBBB" w:sz="1"/>
+              <w:bottom w:val="single" w:color="BBBBBB" w:sz="1"/>
+              <w:right w:val="single" w:color="BBBBBB" w:sz="1"/>
+            </w:tcBorders>
+            <w:shd w:fill="FFFFFF" w:val="clear"/>
+            <w:tcMar>
+              <w:top w:type="dxa" w:w="60"/>
+              <w:left w:type="dxa" w:w="120"/>
+              <w:bottom w:type="dxa" w:w="60"/>
+              <w:right w:type="dxa" w:w="120"/>
+            </w:tcMar>
+          </w:tcPr>
+          <w:p>
+            <w:r>
+              <w:rPr>
+                <w:sz w:val="19"/>
+                <w:szCs w:val="19"/>
+              </w:rPr>
+              <w:t xml:space="preserve">OLED SSD1306 I2C</w:t>
+            </w:r>
+          </w:p>
+        </w:tc>
+        <w:tc>
+          <w:tcPr>
+            <w:tcW w:type="dxa" w:w="3000"/>
+            <w:tcBorders>
+              <w:top w:val="single" w:color="BBBBBB" w:sz="1"/>
+              <w:left w:val="single" w:color="BBBBBB" w:sz="1"/>
+              <w:bottom w:val="single" w:color="BBBBBB" w:sz="1"/>
+              <w:right w:val="single" w:color="BBBBBB" w:sz="1"/>
+            </w:tcBorders>
+            <w:shd w:fill="FFFFFF" w:val="clear"/>
+            <w:tcMar>
+              <w:top w:type="dxa" w:w="60"/>
+              <w:left w:type="dxa" w:w="120"/>
+              <w:bottom w:type="dxa" w:w="60"/>
+              <w:right w:type="dxa" w:w="120"/>
+            </w:tcMar>
+          </w:tcPr>
+          <w:p>
+            <w:r>
+              <w:rPr>
+                <w:sz w:val="19"/>
+                <w:szCs w:val="19"/>
+              </w:rPr>
+              <w:t xml:space="preserve">Afficheur principal</w:t>
+            </w:r>
+          </w:p>
+        </w:tc>
+        <w:tc>
+          <w:tcPr>
+            <w:tcW w:type="dxa" w:w="4060"/>
+            <w:tcBorders>
+              <w:top w:val="single" w:color="BBBBBB" w:sz="1"/>
+              <w:left w:val="single" w:color="BBBBBB" w:sz="1"/>
+              <w:bottom w:val="single" w:color="BBBBBB" w:sz="1"/>
+              <w:right w:val="single" w:color="BBBBBB" w:sz="1"/>
+            </w:tcBorders>
+            <w:shd w:fill="FFFFFF" w:val="clear"/>
+            <w:tcMar>
+              <w:top w:type="dxa" w:w="60"/>
+              <w:left w:type="dxa" w:w="120"/>
+              <w:bottom w:type="dxa" w:w="60"/>
+              <w:right w:type="dxa" w:w="120"/>
+            </w:tcMar>
+          </w:tcPr>
+          <w:p>
+            <w:r>
+              <w:rPr>
+                <w:sz w:val="19"/>
+                <w:szCs w:val="19"/>
+              </w:rPr>
+              <w:t xml:space="preserve">Affichage multi-ecrans lisible, bus I2C</w:t>
+            </w:r>
+          </w:p>
+        </w:tc>
+      </w:tr>
+      <w:tr>
+        <w:tc>
+          <w:tcPr>
+            <w:tcW w:type="dxa" w:w="2300"/>
+            <w:tcBorders>
+              <w:top w:val="single" w:color="BBBBBB" w:sz="1"/>
+              <w:left w:val="single" w:color="BBBBBB" w:sz="1"/>
+              <w:bottom w:val="single" w:color="BBBBBB" w:sz="1"/>
+              <w:right w:val="single" w:color="BBBBBB" w:sz="1"/>
+            </w:tcBorders>
+            <w:shd w:fill="EEF3F8" w:val="clear"/>
+            <w:tcMar>
+              <w:top w:type="dxa" w:w="60"/>
+              <w:left w:type="dxa" w:w="120"/>
+              <w:bottom w:type="dxa" w:w="60"/>
+              <w:right w:type="dxa" w:w="120"/>
+            </w:tcMar>
+          </w:tcPr>
+          <w:p>
+            <w:r>
+              <w:rPr>
+                <w:sz w:val="19"/>
+                <w:szCs w:val="19"/>
+              </w:rPr>
+              <w:t xml:space="preserve">LED verte/orange/rouge</w:t>
+            </w:r>
+          </w:p>
+        </w:tc>
+        <w:tc>
+          <w:tcPr>
+            <w:tcW w:type="dxa" w:w="3000"/>
+            <w:tcBorders>
+              <w:top w:val="single" w:color="BBBBBB" w:sz="1"/>
+              <w:left w:val="single" w:color="BBBBBB" w:sz="1"/>
+              <w:bottom w:val="single" w:color="BBBBBB" w:sz="1"/>
+              <w:right w:val="single" w:color="BBBBBB" w:sz="1"/>
+            </w:tcBorders>
+            <w:shd w:fill="EEF3F8" w:val="clear"/>
+            <w:tcMar>
+              <w:top w:type="dxa" w:w="60"/>
+              <w:left w:type="dxa" w:w="120"/>
+              <w:bottom w:type="dxa" w:w="60"/>
+              <w:right w:type="dxa" w:w="120"/>
+            </w:tcMar>
+          </w:tcPr>
+          <w:p>
+            <w:r>
+              <w:rPr>
+                <w:sz w:val="19"/>
+                <w:szCs w:val="19"/>
+              </w:rPr>
+              <w:t xml:space="preserve">Signalisation des 3 etats</w:t>
+            </w:r>
+          </w:p>
+        </w:tc>
+        <w:tc>
+          <w:tcPr>
+            <w:tcW w:type="dxa" w:w="4060"/>
+            <w:tcBorders>
+              <w:top w:val="single" w:color="BBBBBB" w:sz="1"/>
+              <w:left w:val="single" w:color="BBBBBB" w:sz="1"/>
+              <w:bottom w:val="single" w:color="BBBBBB" w:sz="1"/>
+              <w:right w:val="single" w:color="BBBBBB" w:sz="1"/>
+            </w:tcBorders>
+            <w:shd w:fill="EEF3F8" w:val="clear"/>
+            <w:tcMar>
+              <w:top w:type="dxa" w:w="60"/>
+              <w:left w:type="dxa" w:w="120"/>
+              <w:bottom w:type="dxa" w:w="60"/>
+              <w:right w:type="dxa" w:w="120"/>
+            </w:tcMar>
+          </w:tcPr>
+          <w:p>
+            <w:r>
+              <w:rPr>
+                <w:sz w:val="19"/>
+                <w:szCs w:val="19"/>
+              </w:rPr>
+              <w:t xml:space="preserve">Indication visuelle immediate du niveau</w:t>
+            </w:r>
+          </w:p>
+        </w:tc>
+      </w:tr>
+      <w:tr>
+        <w:tc>
+          <w:tcPr>
+            <w:tcW w:type="dxa" w:w="2300"/>
+            <w:tcBorders>
+              <w:top w:val="single" w:color="BBBBBB" w:sz="1"/>
+              <w:left w:val="single" w:color="BBBBBB" w:sz="1"/>
+              <w:bottom w:val="single" w:color="BBBBBB" w:sz="1"/>
+              <w:right w:val="single" w:color="BBBBBB" w:sz="1"/>
+            </w:tcBorders>
+            <w:shd w:fill="FFFFFF" w:val="clear"/>
+            <w:tcMar>
+              <w:top w:type="dxa" w:w="60"/>
+              <w:left w:type="dxa" w:w="120"/>
+              <w:bottom w:type="dxa" w:w="60"/>
+              <w:right w:type="dxa" w:w="120"/>
+            </w:tcMar>
+          </w:tcPr>
+          <w:p>
+            <w:r>
+              <w:rPr>
+                <w:sz w:val="19"/>
+                <w:szCs w:val="19"/>
+              </w:rPr>
+              <w:t xml:space="preserve">Buzzer</w:t>
+            </w:r>
+          </w:p>
+        </w:tc>
+        <w:tc>
+          <w:tcPr>
+            <w:tcW w:type="dxa" w:w="3000"/>
+            <w:tcBorders>
+              <w:top w:val="single" w:color="BBBBBB" w:sz="1"/>
+              <w:left w:val="single" w:color="BBBBBB" w:sz="1"/>
+              <w:bottom w:val="single" w:color="BBBBBB" w:sz="1"/>
+              <w:right w:val="single" w:color="BBBBBB" w:sz="1"/>
+            </w:tcBorders>
+            <w:shd w:fill="FFFFFF" w:val="clear"/>
+            <w:tcMar>
+              <w:top w:type="dxa" w:w="60"/>
+              <w:left w:type="dxa" w:w="120"/>
+              <w:bottom w:type="dxa" w:w="60"/>
+              <w:right w:type="dxa" w:w="120"/>
+            </w:tcMar>
+          </w:tcPr>
+          <w:p>
+            <w:r>
+              <w:rPr>
+                <w:sz w:val="19"/>
+                <w:szCs w:val="19"/>
+              </w:rPr>
+              <w:t xml:space="preserve">Alerte sonore critique</w:t>
+            </w:r>
+          </w:p>
+        </w:tc>
+        <w:tc>
+          <w:tcPr>
+            <w:tcW w:type="dxa" w:w="4060"/>
+            <w:tcBorders>
+              <w:top w:val="single" w:color="BBBBBB" w:sz="1"/>
+              <w:left w:val="single" w:color="BBBBBB" w:sz="1"/>
+              <w:bottom w:val="single" w:color="BBBBBB" w:sz="1"/>
+              <w:right w:val="single" w:color="BBBBBB" w:sz="1"/>
+            </w:tcBorders>
+            <w:shd w:fill="FFFFFF" w:val="clear"/>
+            <w:tcMar>
+              <w:top w:type="dxa" w:w="60"/>
+              <w:left w:type="dxa" w:w="120"/>
+              <w:bottom w:type="dxa" w:w="60"/>
+              <w:right w:type="dxa" w:w="120"/>
+            </w:tcMar>
+          </w:tcPr>
+          <w:p>
+            <w:r>
+              <w:rPr>
+                <w:sz w:val="19"/>
+                <w:szCs w:val="19"/>
+              </w:rPr>
+              <w:t xml:space="preserve">Alerte active uniquement en etat pollue</w:t>
+            </w:r>
+          </w:p>
+        </w:tc>
+      </w:tr>
+      <w:tr>
+        <w:tc>
+          <w:tcPr>
+            <w:tcW w:type="dxa" w:w="2300"/>
+            <w:tcBorders>
+              <w:top w:val="single" w:color="BBBBBB" w:sz="1"/>
+              <w:left w:val="single" w:color="BBBBBB" w:sz="1"/>
+              <w:bottom w:val="single" w:color="BBBBBB" w:sz="1"/>
+              <w:right w:val="single" w:color="BBBBBB" w:sz="1"/>
+            </w:tcBorders>
+            <w:shd w:fill="EEF3F8" w:val="clear"/>
+            <w:tcMar>
+              <w:top w:type="dxa" w:w="60"/>
+              <w:left w:type="dxa" w:w="120"/>
+              <w:bottom w:type="dxa" w:w="60"/>
+              <w:right w:type="dxa" w:w="120"/>
+            </w:tcMar>
+          </w:tcPr>
+          <w:p>
+            <w:r>
+              <w:rPr>
+                <w:sz w:val="19"/>
+                <w:szCs w:val="19"/>
+              </w:rPr>
+              <w:t xml:space="preserve">3 resistances 220 Ohm</w:t>
+            </w:r>
+          </w:p>
+        </w:tc>
+        <w:tc>
+          <w:tcPr>
+            <w:tcW w:type="dxa" w:w="3000"/>
+            <w:tcBorders>
+              <w:top w:val="single" w:color="BBBBBB" w:sz="1"/>
+              <w:left w:val="single" w:color="BBBBBB" w:sz="1"/>
+              <w:bottom w:val="single" w:color="BBBBBB" w:sz="1"/>
+              <w:right w:val="single" w:color="BBBBBB" w:sz="1"/>
+            </w:tcBorders>
+            <w:shd w:fill="EEF3F8" w:val="clear"/>
+            <w:tcMar>
+              <w:top w:type="dxa" w:w="60"/>
+              <w:left w:type="dxa" w:w="120"/>
+              <w:bottom w:type="dxa" w:w="60"/>
+              <w:right w:type="dxa" w:w="120"/>
+            </w:tcMar>
+          </w:tcPr>
+          <w:p>
+            <w:r>
+              <w:rPr>
+                <w:sz w:val="19"/>
+                <w:szCs w:val="19"/>
+              </w:rPr>
+              <w:t xml:space="preserve">Protection des LEDs</w:t>
+            </w:r>
+          </w:p>
+        </w:tc>
+        <w:tc>
+          <w:tcPr>
+            <w:tcW w:type="dxa" w:w="4060"/>
+            <w:tcBorders>
+              <w:top w:val="single" w:color="BBBBBB" w:sz="1"/>
+              <w:left w:val="single" w:color="BBBBBB" w:sz="1"/>
+              <w:bottom w:val="single" w:color="BBBBBB" w:sz="1"/>
+              <w:right w:val="single" w:color="BBBBBB" w:sz="1"/>
+            </w:tcBorders>
+            <w:shd w:fill="EEF3F8" w:val="clear"/>
+            <w:tcMar>
+              <w:top w:type="dxa" w:w="60"/>
+              <w:left w:type="dxa" w:w="120"/>
+              <w:bottom w:type="dxa" w:w="60"/>
+              <w:right w:type="dxa" w:w="120"/>
+            </w:tcMar>
+          </w:tcPr>
+          <w:p>
+            <w:r>
+              <w:rPr>
+                <w:sz w:val="19"/>
+                <w:szCs w:val="19"/>
+              </w:rPr>
+              <w:t xml:space="preserve">Limitation du courant dans les LEDs</w:t>
+            </w:r>
+          </w:p>
+        </w:tc>
+      </w:tr>
+    </w:tbl>
+    <w:p>
+      <w:r>
+        <w:br w:type="page"/>
+      </w:r>
+    </w:p>
+    <w:p>
+      <w:pPr>
+        <w:pStyle w:val="Heading1"/>
+      </w:pPr>
+      <w:r>
+        <w:t xml:space="preserve">4. Cablage et affectation des broches</w:t>
+      </w:r>
+    </w:p>
+    <w:p>
+      <w:pPr>
+        <w:spacing w:after="120" w:line="276"/>
+        <w:jc w:val="both"/>
+      </w:pPr>
+      <w:r>
+        <w:rPr>
+          <w:sz w:val="22"/>
+          <w:szCs w:val="22"/>
+        </w:rPr>
+        <w:t xml:space="preserve">Le tableau ci-dessous resume les broches utilisees, conformes au cahier des charges.</w:t>
+      </w:r>
+    </w:p>
+    <w:tbl>
+      <w:tblPr>
+        <w:tblW w:type="dxa" w:w="9360"/>
+        <w:tblBorders>
+          <w:top w:val="single" w:color="auto" w:sz="4"/>
+          <w:left w:val="single" w:color="auto" w:sz="4"/>
+          <w:bottom w:val="single" w:color="auto" w:sz="4"/>
+          <w:right w:val="single" w:color="auto" w:sz="4"/>
+          <w:insideH w:val="single" w:color="auto" w:sz="4"/>
+          <w:insideV w:val="single" w:color="auto" w:sz="4"/>
+        </w:tblBorders>
+      </w:tblPr>
+      <w:tblGrid>
+        <w:gridCol w:w="3200"/>
+        <w:gridCol w:w="3160"/>
+        <w:gridCol w:w="3000"/>
+      </w:tblGrid>
+      <w:tr>
+        <w:trPr>
+          <w:tblHeader/>
+        </w:trPr>
+        <w:tc>
+          <w:tcPr>
+            <w:tcW w:type="dxa" w:w="3200"/>
+            <w:tcBorders>
+              <w:top w:val="single" w:color="BBBBBB" w:sz="1"/>
+              <w:left w:val="single" w:color="BBBBBB" w:sz="1"/>
+              <w:bottom w:val="single" w:color="BBBBBB" w:sz="1"/>
+              <w:right w:val="single" w:color="BBBBBB" w:sz="1"/>
+            </w:tcBorders>
+            <w:shd w:fill="2E5C8A" w:val="clear"/>
+            <w:tcMar>
+              <w:top w:type="dxa" w:w="80"/>
+              <w:left w:type="dxa" w:w="120"/>
+              <w:bottom w:type="dxa" w:w="80"/>
+              <w:right w:type="dxa" w:w="120"/>
+            </w:tcMar>
+          </w:tcPr>
+          <w:p>
+            <w:r>
+              <w:rPr>
+                <w:b/>
+                <w:bCs/>
+                <w:color w:val="FFFFFF"/>
+                <w:sz w:val="20"/>
+                <w:szCs w:val="20"/>
+              </w:rPr>
+              <w:t xml:space="preserve">Composant</w:t>
+            </w:r>
+          </w:p>
+        </w:tc>
+        <w:tc>
+          <w:tcPr>
+            <w:tcW w:type="dxa" w:w="3160"/>
+            <w:tcBorders>
+              <w:top w:val="single" w:color="BBBBBB" w:sz="1"/>
+              <w:left w:val="single" w:color="BBBBBB" w:sz="1"/>
+              <w:bottom w:val="single" w:color="BBBBBB" w:sz="1"/>
+              <w:right w:val="single" w:color="BBBBBB" w:sz="1"/>
+            </w:tcBorders>
+            <w:shd w:fill="2E5C8A" w:val="clear"/>
+            <w:tcMar>
+              <w:top w:type="dxa" w:w="80"/>
+              <w:left w:type="dxa" w:w="120"/>
+              <w:bottom w:type="dxa" w:w="80"/>
+              <w:right w:type="dxa" w:w="120"/>
+            </w:tcMar>
+          </w:tcPr>
+          <w:p>
+            <w:r>
+              <w:rPr>
+                <w:b/>
+                <w:bCs/>
+                <w:color w:val="FFFFFF"/>
+                <w:sz w:val="20"/>
+                <w:szCs w:val="20"/>
+              </w:rPr>
+              <w:t xml:space="preserve">Broche ESP32</w:t>
+            </w:r>
+          </w:p>
+        </w:tc>
+        <w:tc>
+          <w:tcPr>
+            <w:tcW w:type="dxa" w:w="3000"/>
+            <w:tcBorders>
+              <w:top w:val="single" w:color="BBBBBB" w:sz="1"/>
+              <w:left w:val="single" w:color="BBBBBB" w:sz="1"/>
+              <w:bottom w:val="single" w:color="BBBBBB" w:sz="1"/>
+              <w:right w:val="single" w:color="BBBBBB" w:sz="1"/>
+            </w:tcBorders>
+            <w:shd w:fill="2E5C8A" w:val="clear"/>
+            <w:tcMar>
+              <w:top w:type="dxa" w:w="80"/>
+              <w:left w:type="dxa" w:w="120"/>
+              <w:bottom w:type="dxa" w:w="80"/>
+              <w:right w:type="dxa" w:w="120"/>
+            </w:tcMar>
+          </w:tcPr>
+          <w:p>
+            <w:r>
+              <w:rPr>
+                <w:b/>
+                <w:bCs/>
+                <w:color w:val="FFFFFF"/>
+                <w:sz w:val="20"/>
+                <w:szCs w:val="20"/>
+              </w:rPr>
+              <w:t xml:space="preserve">Type</w:t>
+            </w:r>
+          </w:p>
+        </w:tc>
+      </w:tr>
+      <w:tr>
+        <w:tc>
+          <w:tcPr>
+            <w:tcW w:type="dxa" w:w="3200"/>
+            <w:tcBorders>
+              <w:top w:val="single" w:color="BBBBBB" w:sz="1"/>
+              <w:left w:val="single" w:color="BBBBBB" w:sz="1"/>
+              <w:bottom w:val="single" w:color="BBBBBB" w:sz="1"/>
+              <w:right w:val="single" w:color="BBBBBB" w:sz="1"/>
+            </w:tcBorders>
+            <w:shd w:fill="FFFFFF" w:val="clear"/>
+            <w:tcMar>
+              <w:top w:type="dxa" w:w="60"/>
+              <w:left w:type="dxa" w:w="120"/>
+              <w:bottom w:type="dxa" w:w="60"/>
+              <w:right w:type="dxa" w:w="120"/>
+            </w:tcMar>
+          </w:tcPr>
+          <w:p>
+            <w:r>
+              <w:rPr>
+                <w:sz w:val="19"/>
+                <w:szCs w:val="19"/>
+              </w:rPr>
+              <w:t xml:space="preserve">DHT22 (data)</w:t>
+            </w:r>
+          </w:p>
+        </w:tc>
+        <w:tc>
+          <w:tcPr>
+            <w:tcW w:type="dxa" w:w="3160"/>
+            <w:tcBorders>
+              <w:top w:val="single" w:color="BBBBBB" w:sz="1"/>
+              <w:left w:val="single" w:color="BBBBBB" w:sz="1"/>
+              <w:bottom w:val="single" w:color="BBBBBB" w:sz="1"/>
+              <w:right w:val="single" w:color="BBBBBB" w:sz="1"/>
+            </w:tcBorders>
+            <w:shd w:fill="FFFFFF" w:val="clear"/>
+            <w:tcMar>
+              <w:top w:type="dxa" w:w="60"/>
+              <w:left w:type="dxa" w:w="120"/>
+              <w:bottom w:type="dxa" w:w="60"/>
+              <w:right w:type="dxa" w:w="120"/>
+            </w:tcMar>
+          </w:tcPr>
+          <w:p>
+            <w:r>
+              <w:rPr>
+                <w:sz w:val="19"/>
+                <w:szCs w:val="19"/>
+              </w:rPr>
+              <w:t xml:space="preserve">GPIO 4</w:t>
+            </w:r>
+          </w:p>
+        </w:tc>
+        <w:tc>
+          <w:tcPr>
+            <w:tcW w:type="dxa" w:w="3000"/>
+            <w:tcBorders>
+              <w:top w:val="single" w:color="BBBBBB" w:sz="1"/>
+              <w:left w:val="single" w:color="BBBBBB" w:sz="1"/>
+              <w:bottom w:val="single" w:color="BBBBBB" w:sz="1"/>
+              <w:right w:val="single" w:color="BBBBBB" w:sz="1"/>
+            </w:tcBorders>
+            <w:shd w:fill="FFFFFF" w:val="clear"/>
+            <w:tcMar>
+              <w:top w:type="dxa" w:w="60"/>
+              <w:left w:type="dxa" w:w="120"/>
+              <w:bottom w:type="dxa" w:w="60"/>
+              <w:right w:type="dxa" w:w="120"/>
+            </w:tcMar>
+          </w:tcPr>
+          <w:p>
+            <w:r>
+              <w:rPr>
+                <w:sz w:val="19"/>
+                <w:szCs w:val="19"/>
+              </w:rPr>
+              <w:t xml:space="preserve">Numerique (OneWire)</w:t>
+            </w:r>
+          </w:p>
+        </w:tc>
+      </w:tr>
+      <w:tr>
+        <w:tc>
+          <w:tcPr>
+            <w:tcW w:type="dxa" w:w="3200"/>
+            <w:tcBorders>
+              <w:top w:val="single" w:color="BBBBBB" w:sz="1"/>
+              <w:left w:val="single" w:color="BBBBBB" w:sz="1"/>
+              <w:bottom w:val="single" w:color="BBBBBB" w:sz="1"/>
+              <w:right w:val="single" w:color="BBBBBB" w:sz="1"/>
+            </w:tcBorders>
+            <w:shd w:fill="EEF3F8" w:val="clear"/>
+            <w:tcMar>
+              <w:top w:type="dxa" w:w="60"/>
+              <w:left w:type="dxa" w:w="120"/>
+              <w:bottom w:type="dxa" w:w="60"/>
+              <w:right w:type="dxa" w:w="120"/>
+            </w:tcMar>
+          </w:tcPr>
+          <w:p>
+            <w:r>
+              <w:rPr>
+                <w:sz w:val="19"/>
+                <w:szCs w:val="19"/>
+              </w:rPr>
+              <w:t xml:space="preserve">Potentiometre (CO2)</w:t>
+            </w:r>
+          </w:p>
+        </w:tc>
+        <w:tc>
+          <w:tcPr>
+            <w:tcW w:type="dxa" w:w="3160"/>
+            <w:tcBorders>
+              <w:top w:val="single" w:color="BBBBBB" w:sz="1"/>
+              <w:left w:val="single" w:color="BBBBBB" w:sz="1"/>
+              <w:bottom w:val="single" w:color="BBBBBB" w:sz="1"/>
+              <w:right w:val="single" w:color="BBBBBB" w:sz="1"/>
+            </w:tcBorders>
+            <w:shd w:fill="EEF3F8" w:val="clear"/>
+            <w:tcMar>
+              <w:top w:type="dxa" w:w="60"/>
+              <w:left w:type="dxa" w:w="120"/>
+              <w:bottom w:type="dxa" w:w="60"/>
+              <w:right w:type="dxa" w:w="120"/>
+            </w:tcMar>
+          </w:tcPr>
+          <w:p>
+            <w:r>
+              <w:rPr>
+                <w:sz w:val="19"/>
+                <w:szCs w:val="19"/>
+              </w:rPr>
+              <w:t xml:space="preserve">GPIO 34</w:t>
+            </w:r>
+          </w:p>
+        </w:tc>
+        <w:tc>
+          <w:tcPr>
+            <w:tcW w:type="dxa" w:w="3000"/>
+            <w:tcBorders>
+              <w:top w:val="single" w:color="BBBBBB" w:sz="1"/>
+              <w:left w:val="single" w:color="BBBBBB" w:sz="1"/>
+              <w:bottom w:val="single" w:color="BBBBBB" w:sz="1"/>
+              <w:right w:val="single" w:color="BBBBBB" w:sz="1"/>
+            </w:tcBorders>
+            <w:shd w:fill="EEF3F8" w:val="clear"/>
+            <w:tcMar>
+              <w:top w:type="dxa" w:w="60"/>
+              <w:left w:type="dxa" w:w="120"/>
+              <w:bottom w:type="dxa" w:w="60"/>
+              <w:right w:type="dxa" w:w="120"/>
+            </w:tcMar>
+          </w:tcPr>
+          <w:p>
+            <w:r>
+              <w:rPr>
+                <w:sz w:val="19"/>
+                <w:szCs w:val="19"/>
+              </w:rPr>
+              <w:t xml:space="preserve">Analogique (ADC)</w:t>
+            </w:r>
+          </w:p>
+        </w:tc>
+      </w:tr>
+      <w:tr>
+        <w:tc>
+          <w:tcPr>
+            <w:tcW w:type="dxa" w:w="3200"/>
+            <w:tcBorders>
+              <w:top w:val="single" w:color="BBBBBB" w:sz="1"/>
+              <w:left w:val="single" w:color="BBBBBB" w:sz="1"/>
+              <w:bottom w:val="single" w:color="BBBBBB" w:sz="1"/>
+              <w:right w:val="single" w:color="BBBBBB" w:sz="1"/>
+            </w:tcBorders>
+            <w:shd w:fill="FFFFFF" w:val="clear"/>
+            <w:tcMar>
+              <w:top w:type="dxa" w:w="60"/>
+              <w:left w:type="dxa" w:w="120"/>
+              <w:bottom w:type="dxa" w:w="60"/>
+              <w:right w:type="dxa" w:w="120"/>
+            </w:tcMar>
+          </w:tcPr>
+          <w:p>
+            <w:r>
+              <w:rPr>
+                <w:sz w:val="19"/>
+                <w:szCs w:val="19"/>
+              </w:rPr>
+              <w:t xml:space="preserve">NTC thermistor</w:t>
+            </w:r>
+          </w:p>
+        </w:tc>
+        <w:tc>
+          <w:tcPr>
+            <w:tcW w:type="dxa" w:w="3160"/>
+            <w:tcBorders>
+              <w:top w:val="single" w:color="BBBBBB" w:sz="1"/>
+              <w:left w:val="single" w:color="BBBBBB" w:sz="1"/>
+              <w:bottom w:val="single" w:color="BBBBBB" w:sz="1"/>
+              <w:right w:val="single" w:color="BBBBBB" w:sz="1"/>
+            </w:tcBorders>
+            <w:shd w:fill="FFFFFF" w:val="clear"/>
+            <w:tcMar>
+              <w:top w:type="dxa" w:w="60"/>
+              <w:left w:type="dxa" w:w="120"/>
+              <w:bottom w:type="dxa" w:w="60"/>
+              <w:right w:type="dxa" w:w="120"/>
+            </w:tcMar>
+          </w:tcPr>
+          <w:p>
+            <w:r>
+              <w:rPr>
+                <w:sz w:val="19"/>
+                <w:szCs w:val="19"/>
+              </w:rPr>
+              <w:t xml:space="preserve">GPIO 35</w:t>
+            </w:r>
+          </w:p>
+        </w:tc>
+        <w:tc>
+          <w:tcPr>
+            <w:tcW w:type="dxa" w:w="3000"/>
+            <w:tcBorders>
+              <w:top w:val="single" w:color="BBBBBB" w:sz="1"/>
+              <w:left w:val="single" w:color="BBBBBB" w:sz="1"/>
+              <w:bottom w:val="single" w:color="BBBBBB" w:sz="1"/>
+              <w:right w:val="single" w:color="BBBBBB" w:sz="1"/>
+            </w:tcBorders>
+            <w:shd w:fill="FFFFFF" w:val="clear"/>
+            <w:tcMar>
+              <w:top w:type="dxa" w:w="60"/>
+              <w:left w:type="dxa" w:w="120"/>
+              <w:bottom w:type="dxa" w:w="60"/>
+              <w:right w:type="dxa" w:w="120"/>
+            </w:tcMar>
+          </w:tcPr>
+          <w:p>
+            <w:r>
+              <w:rPr>
+                <w:sz w:val="19"/>
+                <w:szCs w:val="19"/>
+              </w:rPr>
+              <w:t xml:space="preserve">Analogique (ADC)</w:t>
+            </w:r>
+          </w:p>
+        </w:tc>
+      </w:tr>
+      <w:tr>
+        <w:tc>
+          <w:tcPr>
+            <w:tcW w:type="dxa" w:w="3200"/>
+            <w:tcBorders>
+              <w:top w:val="single" w:color="BBBBBB" w:sz="1"/>
+              <w:left w:val="single" w:color="BBBBBB" w:sz="1"/>
+              <w:bottom w:val="single" w:color="BBBBBB" w:sz="1"/>
+              <w:right w:val="single" w:color="BBBBBB" w:sz="1"/>
+            </w:tcBorders>
+            <w:shd w:fill="EEF3F8" w:val="clear"/>
+            <w:tcMar>
+              <w:top w:type="dxa" w:w="60"/>
+              <w:left w:type="dxa" w:w="120"/>
+              <w:bottom w:type="dxa" w:w="60"/>
+              <w:right w:type="dxa" w:w="120"/>
+            </w:tcMar>
+          </w:tcPr>
+          <w:p>
+            <w:r>
+              <w:rPr>
+                <w:sz w:val="19"/>
+                <w:szCs w:val="19"/>
+              </w:rPr>
+              <w:t xml:space="preserve">LED verte (sain)</w:t>
+            </w:r>
+          </w:p>
+        </w:tc>
+        <w:tc>
+          <w:tcPr>
+            <w:tcW w:type="dxa" w:w="3160"/>
+            <w:tcBorders>
+              <w:top w:val="single" w:color="BBBBBB" w:sz="1"/>
+              <w:left w:val="single" w:color="BBBBBB" w:sz="1"/>
+              <w:bottom w:val="single" w:color="BBBBBB" w:sz="1"/>
+              <w:right w:val="single" w:color="BBBBBB" w:sz="1"/>
+            </w:tcBorders>
+            <w:shd w:fill="EEF3F8" w:val="clear"/>
+            <w:tcMar>
+              <w:top w:type="dxa" w:w="60"/>
+              <w:left w:type="dxa" w:w="120"/>
+              <w:bottom w:type="dxa" w:w="60"/>
+              <w:right w:type="dxa" w:w="120"/>
+            </w:tcMar>
+          </w:tcPr>
+          <w:p>
+            <w:r>
+              <w:rPr>
+                <w:sz w:val="19"/>
+                <w:szCs w:val="19"/>
+              </w:rPr>
+              <w:t xml:space="preserve">GPIO 25</w:t>
+            </w:r>
+          </w:p>
+        </w:tc>
+        <w:tc>
+          <w:tcPr>
+            <w:tcW w:type="dxa" w:w="3000"/>
+            <w:tcBorders>
+              <w:top w:val="single" w:color="BBBBBB" w:sz="1"/>
+              <w:left w:val="single" w:color="BBBBBB" w:sz="1"/>
+              <w:bottom w:val="single" w:color="BBBBBB" w:sz="1"/>
+              <w:right w:val="single" w:color="BBBBBB" w:sz="1"/>
+            </w:tcBorders>
+            <w:shd w:fill="EEF3F8" w:val="clear"/>
+            <w:tcMar>
+              <w:top w:type="dxa" w:w="60"/>
+              <w:left w:type="dxa" w:w="120"/>
+              <w:bottom w:type="dxa" w:w="60"/>
+              <w:right w:type="dxa" w:w="120"/>
+            </w:tcMar>
+          </w:tcPr>
+          <w:p>
+            <w:r>
+              <w:rPr>
+                <w:sz w:val="19"/>
+                <w:szCs w:val="19"/>
+              </w:rPr>
+              <w:t xml:space="preserve">Numerique (sortie)</w:t>
+            </w:r>
+          </w:p>
+        </w:tc>
+      </w:tr>
+      <w:tr>
+        <w:tc>
+          <w:tcPr>
+            <w:tcW w:type="dxa" w:w="3200"/>
+            <w:tcBorders>
+              <w:top w:val="single" w:color="BBBBBB" w:sz="1"/>
+              <w:left w:val="single" w:color="BBBBBB" w:sz="1"/>
+              <w:bottom w:val="single" w:color="BBBBBB" w:sz="1"/>
+              <w:right w:val="single" w:color="BBBBBB" w:sz="1"/>
+            </w:tcBorders>
+            <w:shd w:fill="FFFFFF" w:val="clear"/>
+            <w:tcMar>
+              <w:top w:type="dxa" w:w="60"/>
+              <w:left w:type="dxa" w:w="120"/>
+              <w:bottom w:type="dxa" w:w="60"/>
+              <w:right w:type="dxa" w:w="120"/>
+            </w:tcMar>
+          </w:tcPr>
+          <w:p>
+            <w:r>
+              <w:rPr>
+                <w:sz w:val="19"/>
+                <w:szCs w:val="19"/>
+              </w:rPr>
+              <w:t xml:space="preserve">LED orange (modere)</w:t>
+            </w:r>
+          </w:p>
+        </w:tc>
+        <w:tc>
+          <w:tcPr>
+            <w:tcW w:type="dxa" w:w="3160"/>
+            <w:tcBorders>
+              <w:top w:val="single" w:color="BBBBBB" w:sz="1"/>
+              <w:left w:val="single" w:color="BBBBBB" w:sz="1"/>
+              <w:bottom w:val="single" w:color="BBBBBB" w:sz="1"/>
+              <w:right w:val="single" w:color="BBBBBB" w:sz="1"/>
+            </w:tcBorders>
+            <w:shd w:fill="FFFFFF" w:val="clear"/>
+            <w:tcMar>
+              <w:top w:type="dxa" w:w="60"/>
+              <w:left w:type="dxa" w:w="120"/>
+              <w:bottom w:type="dxa" w:w="60"/>
+              <w:right w:type="dxa" w:w="120"/>
+            </w:tcMar>
+          </w:tcPr>
+          <w:p>
+            <w:r>
+              <w:rPr>
+                <w:sz w:val="19"/>
+                <w:szCs w:val="19"/>
+              </w:rPr>
+              <w:t xml:space="preserve">GPIO 26</w:t>
+            </w:r>
+          </w:p>
+        </w:tc>
+        <w:tc>
+          <w:tcPr>
+            <w:tcW w:type="dxa" w:w="3000"/>
+            <w:tcBorders>
+              <w:top w:val="single" w:color="BBBBBB" w:sz="1"/>
+              <w:left w:val="single" w:color="BBBBBB" w:sz="1"/>
+              <w:bottom w:val="single" w:color="BBBBBB" w:sz="1"/>
+              <w:right w:val="single" w:color="BBBBBB" w:sz="1"/>
+            </w:tcBorders>
+            <w:shd w:fill="FFFFFF" w:val="clear"/>
+            <w:tcMar>
+              <w:top w:type="dxa" w:w="60"/>
+              <w:left w:type="dxa" w:w="120"/>
+              <w:bottom w:type="dxa" w:w="60"/>
+              <w:right w:type="dxa" w:w="120"/>
+            </w:tcMar>
+          </w:tcPr>
+          <w:p>
+            <w:r>
+              <w:rPr>
+                <w:sz w:val="19"/>
+                <w:szCs w:val="19"/>
+              </w:rPr>
+              <w:t xml:space="preserve">Numerique (sortie)</w:t>
+            </w:r>
+          </w:p>
+        </w:tc>
+      </w:tr>
+      <w:tr>
+        <w:tc>
+          <w:tcPr>
+            <w:tcW w:type="dxa" w:w="3200"/>
+            <w:tcBorders>
+              <w:top w:val="single" w:color="BBBBBB" w:sz="1"/>
+              <w:left w:val="single" w:color="BBBBBB" w:sz="1"/>
+              <w:bottom w:val="single" w:color="BBBBBB" w:sz="1"/>
+              <w:right w:val="single" w:color="BBBBBB" w:sz="1"/>
+            </w:tcBorders>
+            <w:shd w:fill="EEF3F8" w:val="clear"/>
+            <w:tcMar>
+              <w:top w:type="dxa" w:w="60"/>
+              <w:left w:type="dxa" w:w="120"/>
+              <w:bottom w:type="dxa" w:w="60"/>
+              <w:right w:type="dxa" w:w="120"/>
+            </w:tcMar>
+          </w:tcPr>
+          <w:p>
+            <w:r>
+              <w:rPr>
+                <w:sz w:val="19"/>
+                <w:szCs w:val="19"/>
+              </w:rPr>
+              <w:t xml:space="preserve">LED rouge (pollue)</w:t>
+            </w:r>
+          </w:p>
+        </w:tc>
+        <w:tc>
+          <w:tcPr>
+            <w:tcW w:type="dxa" w:w="3160"/>
+            <w:tcBorders>
+              <w:top w:val="single" w:color="BBBBBB" w:sz="1"/>
+              <w:left w:val="single" w:color="BBBBBB" w:sz="1"/>
+              <w:bottom w:val="single" w:color="BBBBBB" w:sz="1"/>
+              <w:right w:val="single" w:color="BBBBBB" w:sz="1"/>
+            </w:tcBorders>
+            <w:shd w:fill="EEF3F8" w:val="clear"/>
+            <w:tcMar>
+              <w:top w:type="dxa" w:w="60"/>
+              <w:left w:type="dxa" w:w="120"/>
+              <w:bottom w:type="dxa" w:w="60"/>
+              <w:right w:type="dxa" w:w="120"/>
+            </w:tcMar>
+          </w:tcPr>
+          <w:p>
+            <w:r>
+              <w:rPr>
+                <w:sz w:val="19"/>
+                <w:szCs w:val="19"/>
+              </w:rPr>
+              <w:t xml:space="preserve">GPIO 27</w:t>
+            </w:r>
+          </w:p>
+        </w:tc>
+        <w:tc>
+          <w:tcPr>
+            <w:tcW w:type="dxa" w:w="3000"/>
+            <w:tcBorders>
+              <w:top w:val="single" w:color="BBBBBB" w:sz="1"/>
+              <w:left w:val="single" w:color="BBBBBB" w:sz="1"/>
+              <w:bottom w:val="single" w:color="BBBBBB" w:sz="1"/>
+              <w:right w:val="single" w:color="BBBBBB" w:sz="1"/>
+            </w:tcBorders>
+            <w:shd w:fill="EEF3F8" w:val="clear"/>
+            <w:tcMar>
+              <w:top w:type="dxa" w:w="60"/>
+              <w:left w:type="dxa" w:w="120"/>
+              <w:bottom w:type="dxa" w:w="60"/>
+              <w:right w:type="dxa" w:w="120"/>
+            </w:tcMar>
+          </w:tcPr>
+          <w:p>
+            <w:r>
+              <w:rPr>
+                <w:sz w:val="19"/>
+                <w:szCs w:val="19"/>
+              </w:rPr>
+              <w:t xml:space="preserve">Numerique (sortie)</w:t>
+            </w:r>
+          </w:p>
+        </w:tc>
+      </w:tr>
+      <w:tr>
+        <w:tc>
+          <w:tcPr>
+            <w:tcW w:type="dxa" w:w="3200"/>
+            <w:tcBorders>
+              <w:top w:val="single" w:color="BBBBBB" w:sz="1"/>
+              <w:left w:val="single" w:color="BBBBBB" w:sz="1"/>
+              <w:bottom w:val="single" w:color="BBBBBB" w:sz="1"/>
+              <w:right w:val="single" w:color="BBBBBB" w:sz="1"/>
+            </w:tcBorders>
+            <w:shd w:fill="FFFFFF" w:val="clear"/>
+            <w:tcMar>
+              <w:top w:type="dxa" w:w="60"/>
+              <w:left w:type="dxa" w:w="120"/>
+              <w:bottom w:type="dxa" w:w="60"/>
+              <w:right w:type="dxa" w:w="120"/>
+            </w:tcMar>
+          </w:tcPr>
+          <w:p>
+            <w:r>
+              <w:rPr>
+                <w:sz w:val="19"/>
+                <w:szCs w:val="19"/>
+              </w:rPr>
+              <w:t xml:space="preserve">Buzzer</w:t>
+            </w:r>
+          </w:p>
+        </w:tc>
+        <w:tc>
+          <w:tcPr>
+            <w:tcW w:type="dxa" w:w="3160"/>
+            <w:tcBorders>
+              <w:top w:val="single" w:color="BBBBBB" w:sz="1"/>
+              <w:left w:val="single" w:color="BBBBBB" w:sz="1"/>
+              <w:bottom w:val="single" w:color="BBBBBB" w:sz="1"/>
+              <w:right w:val="single" w:color="BBBBBB" w:sz="1"/>
+            </w:tcBorders>
+            <w:shd w:fill="FFFFFF" w:val="clear"/>
+            <w:tcMar>
+              <w:top w:type="dxa" w:w="60"/>
+              <w:left w:type="dxa" w:w="120"/>
+              <w:bottom w:type="dxa" w:w="60"/>
+              <w:right w:type="dxa" w:w="120"/>
+            </w:tcMar>
+          </w:tcPr>
+          <w:p>
+            <w:r>
+              <w:rPr>
+                <w:sz w:val="19"/>
+                <w:szCs w:val="19"/>
+              </w:rPr>
+              <w:t xml:space="preserve">GPIO 14</w:t>
+            </w:r>
+          </w:p>
+        </w:tc>
+        <w:tc>
+          <w:tcPr>
+            <w:tcW w:type="dxa" w:w="3000"/>
+            <w:tcBorders>
+              <w:top w:val="single" w:color="BBBBBB" w:sz="1"/>
+              <w:left w:val="single" w:color="BBBBBB" w:sz="1"/>
+              <w:bottom w:val="single" w:color="BBBBBB" w:sz="1"/>
+              <w:right w:val="single" w:color="BBBBBB" w:sz="1"/>
+            </w:tcBorders>
+            <w:shd w:fill="FFFFFF" w:val="clear"/>
+            <w:tcMar>
+              <w:top w:type="dxa" w:w="60"/>
+              <w:left w:type="dxa" w:w="120"/>
+              <w:bottom w:type="dxa" w:w="60"/>
+              <w:right w:type="dxa" w:w="120"/>
+            </w:tcMar>
+          </w:tcPr>
+          <w:p>
+            <w:r>
+              <w:rPr>
+                <w:sz w:val="19"/>
+                <w:szCs w:val="19"/>
+              </w:rPr>
+              <w:t xml:space="preserve">Numerique (sortie)</w:t>
+            </w:r>
+          </w:p>
+        </w:tc>
+      </w:tr>
+      <w:tr>
+        <w:tc>
+          <w:tcPr>
+            <w:tcW w:type="dxa" w:w="3200"/>
+            <w:tcBorders>
+              <w:top w:val="single" w:color="BBBBBB" w:sz="1"/>
+              <w:left w:val="single" w:color="BBBBBB" w:sz="1"/>
+              <w:bottom w:val="single" w:color="BBBBBB" w:sz="1"/>
+              <w:right w:val="single" w:color="BBBBBB" w:sz="1"/>
+            </w:tcBorders>
+            <w:shd w:fill="EEF3F8" w:val="clear"/>
+            <w:tcMar>
+              <w:top w:type="dxa" w:w="60"/>
+              <w:left w:type="dxa" w:w="120"/>
+              <w:bottom w:type="dxa" w:w="60"/>
+              <w:right w:type="dxa" w:w="120"/>
+            </w:tcMar>
+          </w:tcPr>
+          <w:p>
+            <w:r>
+              <w:rPr>
+                <w:sz w:val="19"/>
+                <w:szCs w:val="19"/>
+              </w:rPr>
+              <w:t xml:space="preserve">OLED SDA / SCL</w:t>
+            </w:r>
+          </w:p>
+        </w:tc>
+        <w:tc>
+          <w:tcPr>
+            <w:tcW w:type="dxa" w:w="3160"/>
+            <w:tcBorders>
+              <w:top w:val="single" w:color="BBBBBB" w:sz="1"/>
+              <w:left w:val="single" w:color="BBBBBB" w:sz="1"/>
+              <w:bottom w:val="single" w:color="BBBBBB" w:sz="1"/>
+              <w:right w:val="single" w:color="BBBBBB" w:sz="1"/>
+            </w:tcBorders>
+            <w:shd w:fill="EEF3F8" w:val="clear"/>
+            <w:tcMar>
+              <w:top w:type="dxa" w:w="60"/>
+              <w:left w:type="dxa" w:w="120"/>
+              <w:bottom w:type="dxa" w:w="60"/>
+              <w:right w:type="dxa" w:w="120"/>
+            </w:tcMar>
+          </w:tcPr>
+          <w:p>
+            <w:r>
+              <w:rPr>
+                <w:sz w:val="19"/>
+                <w:szCs w:val="19"/>
+              </w:rPr>
+              <w:t xml:space="preserve">GPIO 21 / GPIO 22</w:t>
+            </w:r>
+          </w:p>
+        </w:tc>
+        <w:tc>
+          <w:tcPr>
+            <w:tcW w:type="dxa" w:w="3000"/>
+            <w:tcBorders>
+              <w:top w:val="single" w:color="BBBBBB" w:sz="1"/>
+              <w:left w:val="single" w:color="BBBBBB" w:sz="1"/>
+              <w:bottom w:val="single" w:color="BBBBBB" w:sz="1"/>
+              <w:right w:val="single" w:color="BBBBBB" w:sz="1"/>
+            </w:tcBorders>
+            <w:shd w:fill="EEF3F8" w:val="clear"/>
+            <w:tcMar>
+              <w:top w:type="dxa" w:w="60"/>
+              <w:left w:type="dxa" w:w="120"/>
+              <w:bottom w:type="dxa" w:w="60"/>
+              <w:right w:type="dxa" w:w="120"/>
+            </w:tcMar>
+          </w:tcPr>
+          <w:p>
+            <w:r>
+              <w:rPr>
+                <w:sz w:val="19"/>
+                <w:szCs w:val="19"/>
+              </w:rPr>
+              <w:t xml:space="preserve">Bus I2C</w:t>
+            </w:r>
+          </w:p>
+        </w:tc>
+      </w:tr>
+    </w:tbl>
+    <w:p>
+      <w:r>
+        <w:t xml:space="preserve"/>
+      </w:r>
+    </w:p>
+    <w:p>
+      <w:pPr>
+        <w:spacing w:after="60"/>
+        <w:jc w:val="center"/>
+      </w:pPr>
+      <w:r>
+        <w:drawing>
+          <wp:inline distT="0" distB="0" distL="0" distR="0">
+            <wp:extent cx="5715000" cy="4905375"/>
+            <wp:effectExtent t="0" r="0" b="0" l="0"/>
+            <wp:docPr id="1" name="fig2_cablage.png" descr="Figure 2 : Schema de cablage complet sur Wokwi (diagram.json)" title="Figure 2 : Schema de cablage complet sur Wokwi (diagram.json)"/>
+            <wp:cNvGraphicFramePr>
+              <a:graphicFrameLocks xmlns:a="http://schemas.openxmlformats.org/drawingml/2006/main" noChangeAspect="1"/>
+            </wp:cNvGraphicFramePr>
+            <a:graphic xmlns:a="http://schemas.openxmlformats.org/drawingml/2006/main">
+              <a:graphicData uri="http://schemas.openxmlformats.org/drawingml/2006/picture">
+                <pic:pic xmlns:pic="http://schemas.openxmlformats.org/drawingml/2006/picture">
+                  <pic:nvPicPr>
+                    <pic:cNvPr id="0" name="" descr=""/>
+                    <pic:cNvPicPr>
+                      <a:picLocks noChangeAspect="1" noChangeArrowheads="1"/>
+                    </pic:cNvPicPr>
+                  </pic:nvPicPr>
+                  <pic:blipFill>
+                    <a:blip r:embed="rId10" cstate="none"/>
+                    <a:srcRect/>
+                    <a:stretch>
+                      <a:fillRect/>
+                    </a:stretch>
+                  </pic:blipFill>
+                  <pic:spPr bwMode="auto">
+                    <a:xfrm>
+                      <a:off x="0" y="0"/>
                       <a:ext cx="5715000" cy="4905375"/>
                     </a:xfrm>
                     <a:prstGeom prst="rect">
@@ -7530,7 +7509,7 @@
                     </pic:cNvPicPr>
                   </pic:nvPicPr>
                   <pic:blipFill>
-                    <a:blip r:embed="rId10" cstate="none"/>
+                    <a:blip r:embed="rId11" cstate="none"/>
                     <a:srcRect/>
                     <a:stretch>
                       <a:fillRect/>
@@ -7568,57 +7547,6 @@
             <wp:extent cx="5715000" cy="2914650"/>
             <wp:effectExtent t="0" r="0" b="0" l="0"/>
             <wp:docPr id="1" name="fig4_dashboard.png" descr="Figure 4 : Tableau de bord Blynk (4 jauges + LED couleur + graphique d'historique)" title="Figure 4 : Tableau de bord Blynk (4 jauges + LED couleur + graphique d'historique)"/>
-            <wp:cNvGraphicFramePr>
-              <a:graphicFrameLocks xmlns:a="http://schemas.openxmlformats.org/drawingml/2006/main" noChangeAspect="1"/>
-            </wp:cNvGraphicFramePr>
-            <a:graphic xmlns:a="http://schemas.openxmlformats.org/drawingml/2006/main">
-              <a:graphicData uri="http://schemas.openxmlformats.org/drawingml/2006/picture">
-                <pic:pic xmlns:pic="http://schemas.openxmlformats.org/drawingml/2006/picture">
-                  <pic:nvPicPr>
-                    <pic:cNvPr id="0" name="" descr=""/>
-                    <pic:cNvPicPr>
-                      <a:picLocks noChangeAspect="1" noChangeArrowheads="1"/>
-                    </pic:cNvPicPr>
-                  </pic:nvPicPr>
-                  <pic:blipFill>
-                    <a:blip r:embed="rId11" cstate="none"/>
-                    <a:srcRect/>
-                    <a:stretch>
-                      <a:fillRect/>
-                    </a:stretch>
-                  </pic:blipFill>
-                  <pic:spPr bwMode="auto">
-                    <a:xfrm>
-                      <a:off x="0" y="0"/>
-                      <a:ext cx="5715000" cy="2914650"/>
-                    </a:xfrm>
-                    <a:prstGeom prst="rect">
-                      <a:avLst/>
-                    </a:prstGeom>
-                  </pic:spPr>
-                </pic:pic>
-              </a:graphicData>
-            </a:graphic>
-          </wp:inline>
-        </w:drawing>
-      </w:r>
-    </w:p>
-    <w:p>
-      <w:r>
-        <w:t xml:space="preserve"/>
-      </w:r>
-    </w:p>
-    <w:p>
-      <w:pPr>
-        <w:spacing w:after="60"/>
-        <w:jc w:val="center"/>
-      </w:pPr>
-      <w:r>
-        <w:drawing>
-          <wp:inline distT="0" distB="0" distL="0" distR="0">
-            <wp:extent cx="5715000" cy="2914650"/>
-            <wp:effectExtent t="0" r="0" b="0" l="0"/>
-            <wp:docPr id="1" name="fig5_notification.png" descr="Figure 5 : Notification push Blynk a l'entree en etat pollue" title="Figure 5 : Notification push Blynk a l'entree en etat pollue"/>
             <wp:cNvGraphicFramePr>
               <a:graphicFrameLocks xmlns:a="http://schemas.openxmlformats.org/drawingml/2006/main" noChangeAspect="1"/>
             </wp:cNvGraphicFramePr>
@@ -7656,6 +7584,57 @@
     </w:p>
     <w:p>
       <w:r>
+        <w:t xml:space="preserve"/>
+      </w:r>
+    </w:p>
+    <w:p>
+      <w:pPr>
+        <w:spacing w:after="60"/>
+        <w:jc w:val="center"/>
+      </w:pPr>
+      <w:r>
+        <w:drawing>
+          <wp:inline distT="0" distB="0" distL="0" distR="0">
+            <wp:extent cx="5715000" cy="2914650"/>
+            <wp:effectExtent t="0" r="0" b="0" l="0"/>
+            <wp:docPr id="1" name="fig5_notification.png" descr="Figure 5 : Notification push Blynk a l'entree en etat pollue" title="Figure 5 : Notification push Blynk a l'entree en etat pollue"/>
+            <wp:cNvGraphicFramePr>
+              <a:graphicFrameLocks xmlns:a="http://schemas.openxmlformats.org/drawingml/2006/main" noChangeAspect="1"/>
+            </wp:cNvGraphicFramePr>
+            <a:graphic xmlns:a="http://schemas.openxmlformats.org/drawingml/2006/main">
+              <a:graphicData uri="http://schemas.openxmlformats.org/drawingml/2006/picture">
+                <pic:pic xmlns:pic="http://schemas.openxmlformats.org/drawingml/2006/picture">
+                  <pic:nvPicPr>
+                    <pic:cNvPr id="0" name="" descr=""/>
+                    <pic:cNvPicPr>
+                      <a:picLocks noChangeAspect="1" noChangeArrowheads="1"/>
+                    </pic:cNvPicPr>
+                  </pic:nvPicPr>
+                  <pic:blipFill>
+                    <a:blip r:embed="rId13" cstate="none"/>
+                    <a:srcRect/>
+                    <a:stretch>
+                      <a:fillRect/>
+                    </a:stretch>
+                  </pic:blipFill>
+                  <pic:spPr bwMode="auto">
+                    <a:xfrm>
+                      <a:off x="0" y="0"/>
+                      <a:ext cx="5715000" cy="2914650"/>
+                    </a:xfrm>
+                    <a:prstGeom prst="rect">
+                      <a:avLst/>
+                    </a:prstGeom>
+                  </pic:spPr>
+                </pic:pic>
+              </a:graphicData>
+            </a:graphic>
+          </wp:inline>
+        </w:drawing>
+      </w:r>
+    </w:p>
+    <w:p>
+      <w:r>
         <w:br w:type="page"/>
       </w:r>
     </w:p>
@@ -8501,7 +8480,7 @@
                     </pic:cNvPicPr>
                   </pic:nvPicPr>
                   <pic:blipFill>
-                    <a:blip r:embed="rId13" cstate="none"/>
+                    <a:blip r:embed="rId14" cstate="none"/>
                     <a:srcRect/>
                     <a:stretch>
                       <a:fillRect/>
@@ -8539,57 +8518,6 @@
             <wp:extent cx="5715000" cy="5276850"/>
             <wp:effectExtent t="0" r="0" b="0" l="0"/>
             <wp:docPr id="1" name="fig7_modere.png" descr="Figure 7 : Profil air MODERE - OLED + LED orange (Wokwi)" title="Figure 7 : Profil air MODERE - OLED + LED orange (Wokwi)"/>
-            <wp:cNvGraphicFramePr>
-              <a:graphicFrameLocks xmlns:a="http://schemas.openxmlformats.org/drawingml/2006/main" noChangeAspect="1"/>
-            </wp:cNvGraphicFramePr>
-            <a:graphic xmlns:a="http://schemas.openxmlformats.org/drawingml/2006/main">
-              <a:graphicData uri="http://schemas.openxmlformats.org/drawingml/2006/picture">
-                <pic:pic xmlns:pic="http://schemas.openxmlformats.org/drawingml/2006/picture">
-                  <pic:nvPicPr>
-                    <pic:cNvPr id="0" name="" descr=""/>
-                    <pic:cNvPicPr>
-                      <a:picLocks noChangeAspect="1" noChangeArrowheads="1"/>
-                    </pic:cNvPicPr>
-                  </pic:nvPicPr>
-                  <pic:blipFill>
-                    <a:blip r:embed="rId14" cstate="none"/>
-                    <a:srcRect/>
-                    <a:stretch>
-                      <a:fillRect/>
-                    </a:stretch>
-                  </pic:blipFill>
-                  <pic:spPr bwMode="auto">
-                    <a:xfrm>
-                      <a:off x="0" y="0"/>
-                      <a:ext cx="5715000" cy="5276850"/>
-                    </a:xfrm>
-                    <a:prstGeom prst="rect">
-                      <a:avLst/>
-                    </a:prstGeom>
-                  </pic:spPr>
-                </pic:pic>
-              </a:graphicData>
-            </a:graphic>
-          </wp:inline>
-        </w:drawing>
-      </w:r>
-    </w:p>
-    <w:p>
-      <w:r>
-        <w:t xml:space="preserve"/>
-      </w:r>
-    </w:p>
-    <w:p>
-      <w:pPr>
-        <w:spacing w:after="60"/>
-        <w:jc w:val="center"/>
-      </w:pPr>
-      <w:r>
-        <w:drawing>
-          <wp:inline distT="0" distB="0" distL="0" distR="0">
-            <wp:extent cx="5715000" cy="4905375"/>
-            <wp:effectExtent t="0" r="0" b="0" l="0"/>
-            <wp:docPr id="1" name="fig8_pollue.png" descr="Figure 8 : Profil air POLLUE - OLED + LED rouge + buzzer (Wokwi)" title="Figure 8 : Profil air POLLUE - OLED + LED rouge + buzzer (Wokwi)"/>
             <wp:cNvGraphicFramePr>
               <a:graphicFrameLocks xmlns:a="http://schemas.openxmlformats.org/drawingml/2006/main" noChangeAspect="1"/>
             </wp:cNvGraphicFramePr>
@@ -8612,6 +8540,57 @@
                   <pic:spPr bwMode="auto">
                     <a:xfrm>
                       <a:off x="0" y="0"/>
+                      <a:ext cx="5715000" cy="5276850"/>
+                    </a:xfrm>
+                    <a:prstGeom prst="rect">
+                      <a:avLst/>
+                    </a:prstGeom>
+                  </pic:spPr>
+                </pic:pic>
+              </a:graphicData>
+            </a:graphic>
+          </wp:inline>
+        </w:drawing>
+      </w:r>
+    </w:p>
+    <w:p>
+      <w:r>
+        <w:t xml:space="preserve"/>
+      </w:r>
+    </w:p>
+    <w:p>
+      <w:pPr>
+        <w:spacing w:after="60"/>
+        <w:jc w:val="center"/>
+      </w:pPr>
+      <w:r>
+        <w:drawing>
+          <wp:inline distT="0" distB="0" distL="0" distR="0">
+            <wp:extent cx="5715000" cy="4905375"/>
+            <wp:effectExtent t="0" r="0" b="0" l="0"/>
+            <wp:docPr id="1" name="fig8_pollue.png" descr="Figure 8 : Profil air POLLUE - OLED + LED rouge + buzzer (Wokwi)" title="Figure 8 : Profil air POLLUE - OLED + LED rouge + buzzer (Wokwi)"/>
+            <wp:cNvGraphicFramePr>
+              <a:graphicFrameLocks xmlns:a="http://schemas.openxmlformats.org/drawingml/2006/main" noChangeAspect="1"/>
+            </wp:cNvGraphicFramePr>
+            <a:graphic xmlns:a="http://schemas.openxmlformats.org/drawingml/2006/main">
+              <a:graphicData uri="http://schemas.openxmlformats.org/drawingml/2006/picture">
+                <pic:pic xmlns:pic="http://schemas.openxmlformats.org/drawingml/2006/picture">
+                  <pic:nvPicPr>
+                    <pic:cNvPr id="0" name="" descr=""/>
+                    <pic:cNvPicPr>
+                      <a:picLocks noChangeAspect="1" noChangeArrowheads="1"/>
+                    </pic:cNvPicPr>
+                  </pic:nvPicPr>
+                  <pic:blipFill>
+                    <a:blip r:embed="rId16" cstate="none"/>
+                    <a:srcRect/>
+                    <a:stretch>
+                      <a:fillRect/>
+                    </a:stretch>
+                  </pic:blipFill>
+                  <pic:spPr bwMode="auto">
+                    <a:xfrm>
+                      <a:off x="0" y="0"/>
                       <a:ext cx="5715000" cy="4905375"/>
                     </a:xfrm>
                     <a:prstGeom prst="rect">
@@ -8900,7 +8879,7 @@
         </w:rPr>
         <w:t xml:space="preserve">Simulation Wokwi : </w:t>
       </w:r>
-      <w:hyperlink w:history="1" r:id="rIdbkj7qsywlam8syt81npfu">
+      <w:hyperlink w:history="1" r:id="rIdgsiitdclmmojmsfgo0d-5">
         <w:r>
           <w:rPr>
             <w:rStyle w:val="Hyperlink"/>
@@ -8924,7 +8903,7 @@
         </w:rPr>
         <w:t xml:space="preserve">Depot Git : </w:t>
       </w:r>
-      <w:hyperlink w:history="1" r:id="rIdaskbztv5ofbo4ny5dvcby">
+      <w:hyperlink w:history="1" r:id="rIdbex5evhx_bljjrtbh437s">
         <w:r>
           <w:rPr>
             <w:rStyle w:val="Hyperlink"/>

</xml_diff>